<commit_message>
docs: escopo do projeto v0.3 OP#166
</commit_message>
<xml_diff>
--- a/docs/ESCOPO-0102-grupo05 v2.docx
+++ b/docs/ESCOPO-0102-grupo05 v2.docx
@@ -1,6 +1,6 @@
 
 <file path=word/document.xml><?xml version="1.0" encoding="utf-8"?>
-<w:document xmlns:wpc="http://schemas.microsoft.com/office/word/2010/wordprocessingCanvas" xmlns:cx="http://schemas.microsoft.com/office/drawing/2014/chartex" xmlns:cx1="http://schemas.microsoft.com/office/drawing/2015/9/8/chartex" xmlns:cx2="http://schemas.microsoft.com/office/drawing/2015/10/21/chartex" xmlns:cx3="http://schemas.microsoft.com/office/drawing/2016/5/9/chartex" xmlns:cx4="http://schemas.microsoft.com/office/drawing/2016/5/10/chartex" xmlns:cx5="http://schemas.microsoft.com/office/drawing/2016/5/11/chartex" xmlns:cx6="http://schemas.microsoft.com/office/drawing/2016/5/12/chartex" xmlns:cx7="http://schemas.microsoft.com/office/drawing/2016/5/13/chartex" xmlns:cx8="http://schemas.microsoft.com/office/drawing/2016/5/14/chartex" xmlns:mc="http://schemas.openxmlformats.org/markup-compatibility/2006" xmlns:aink="http://schemas.microsoft.com/office/drawing/2016/ink" xmlns:am3d="http://schemas.microsoft.com/office/drawing/2017/model3d" xmlns:o="urn:schemas-microsoft-com:office:office" xmlns:oel="http://schemas.microsoft.com/office/2019/extlst" xmlns:r="http://schemas.openxmlformats.org/officeDocument/2006/relationships" xmlns:m="http://schemas.openxmlformats.org/officeDocument/2006/math" xmlns:v="urn:schemas-microsoft-com:vml" xmlns:wp14="http://schemas.microsoft.com/office/word/2010/wordprocessingDrawing" xmlns:wp="http://schemas.openxmlformats.org/drawingml/2006/wordprocessingDrawing" xmlns:w10="urn:schemas-microsoft-com:office:word" xmlns:w="http://schemas.openxmlformats.org/wordprocessingml/2006/main" xmlns:w14="http://schemas.microsoft.com/office/word/2010/wordml" xmlns:w15="http://schemas.microsoft.com/office/word/2012/wordml" xmlns:w16cex="http://schemas.microsoft.com/office/word/2018/wordml/cex" xmlns:w16cid="http://schemas.microsoft.com/office/word/2016/wordml/cid" xmlns:w16="http://schemas.microsoft.com/office/word/2018/wordml" xmlns:w16du="http://schemas.microsoft.com/office/word/2023/wordml/word16du" xmlns:w16sdtdh="http://schemas.microsoft.com/office/word/2020/wordml/sdtdatahash" xmlns:w16sdtfl="http://schemas.microsoft.com/office/word/2024/wordml/sdtformatlock" xmlns:w16se="http://schemas.microsoft.com/office/word/2015/wordml/symex" xmlns:wpg="http://schemas.microsoft.com/office/word/2010/wordprocessingGroup" xmlns:wpi="http://schemas.microsoft.com/office/word/2010/wordprocessingInk" xmlns:wne="http://schemas.microsoft.com/office/word/2006/wordml" xmlns:wps="http://schemas.microsoft.com/office/word/2010/wordprocessingShape" mc:Ignorable="w14 w15 w16se w16cid w16 w16cex w16sdtdh w16sdtfl w16du wp14">
+<w:document xmlns:wpc="http://schemas.microsoft.com/office/word/2010/wordprocessingCanvas" xmlns:cx="http://schemas.microsoft.com/office/drawing/2014/chartex" xmlns:cx1="http://schemas.microsoft.com/office/drawing/2015/9/8/chartex" xmlns:cx2="http://schemas.microsoft.com/office/drawing/2015/10/21/chartex" xmlns:cx3="http://schemas.microsoft.com/office/drawing/2016/5/9/chartex" xmlns:cx4="http://schemas.microsoft.com/office/drawing/2016/5/10/chartex" xmlns:cx5="http://schemas.microsoft.com/office/drawing/2016/5/11/chartex" xmlns:cx6="http://schemas.microsoft.com/office/drawing/2016/5/12/chartex" xmlns:cx7="http://schemas.microsoft.com/office/drawing/2016/5/13/chartex" xmlns:cx8="http://schemas.microsoft.com/office/drawing/2016/5/14/chartex" xmlns:mc="http://schemas.openxmlformats.org/markup-compatibility/2006" xmlns:aink="http://schemas.microsoft.com/office/drawing/2016/ink" xmlns:am3d="http://schemas.microsoft.com/office/drawing/2017/model3d" xmlns:o="urn:schemas-microsoft-com:office:office" xmlns:r="http://schemas.openxmlformats.org/officeDocument/2006/relationships" xmlns:m="http://schemas.openxmlformats.org/officeDocument/2006/math" xmlns:v="urn:schemas-microsoft-com:vml" xmlns:wp14="http://schemas.microsoft.com/office/word/2010/wordprocessingDrawing" xmlns:wp="http://schemas.openxmlformats.org/drawingml/2006/wordprocessingDrawing" xmlns:w10="urn:schemas-microsoft-com:office:word" xmlns:w="http://schemas.openxmlformats.org/wordprocessingml/2006/main" xmlns:w14="http://schemas.microsoft.com/office/word/2010/wordml" xmlns:w15="http://schemas.microsoft.com/office/word/2012/wordml" xmlns:w16cid="http://schemas.microsoft.com/office/word/2016/wordml/cid" xmlns:w16se="http://schemas.microsoft.com/office/word/2015/wordml/symex" xmlns:wpg="http://schemas.microsoft.com/office/word/2010/wordprocessingGroup" xmlns:wpi="http://schemas.microsoft.com/office/word/2010/wordprocessingInk" xmlns:wne="http://schemas.microsoft.com/office/word/2006/wordml" xmlns:wps="http://schemas.microsoft.com/office/word/2010/wordprocessingShape" mc:Ignorable="w14 w15 w16se w16cid wp14">
   <w:body>
     <w:p>
       <w:pPr>
@@ -573,13 +573,996 @@
         <w:t>Escopo</w:t>
       </w:r>
     </w:p>
+    <w:tbl>
+      <w:tblPr>
+        <w:tblpPr w:leftFromText="141" w:rightFromText="141" w:vertAnchor="text" w:horzAnchor="margin" w:tblpXSpec="center" w:tblpY="278"/>
+        <w:tblW w:w="10161" w:type="dxa"/>
+        <w:shd w:val="clear" w:color="auto" w:fill="FFFFFF"/>
+        <w:tblCellMar>
+          <w:top w:w="15" w:type="dxa"/>
+          <w:left w:w="15" w:type="dxa"/>
+          <w:bottom w:w="15" w:type="dxa"/>
+          <w:right w:w="15" w:type="dxa"/>
+        </w:tblCellMar>
+        <w:tblLook w:val="04A0" w:firstRow="1" w:lastRow="0" w:firstColumn="1" w:lastColumn="0" w:noHBand="0" w:noVBand="1"/>
+      </w:tblPr>
+      <w:tblGrid>
+        <w:gridCol w:w="602"/>
+        <w:gridCol w:w="3162"/>
+        <w:gridCol w:w="4774"/>
+        <w:gridCol w:w="773"/>
+        <w:gridCol w:w="850"/>
+      </w:tblGrid>
+      <w:tr>
+        <w:trPr>
+          <w:trHeight w:val="144"/>
+          <w:tblHeader/>
+        </w:trPr>
+        <w:tc>
+          <w:tcPr>
+            <w:tcW w:w="0" w:type="auto"/>
+            <w:tcBorders>
+              <w:bottom w:val="single" w:sz="12" w:space="0" w:color="D9E4F2"/>
+            </w:tcBorders>
+            <w:shd w:val="clear" w:color="auto" w:fill="FFFFFF"/>
+            <w:tcMar>
+              <w:top w:w="135" w:type="dxa"/>
+              <w:left w:w="180" w:type="dxa"/>
+              <w:bottom w:w="135" w:type="dxa"/>
+              <w:right w:w="180" w:type="dxa"/>
+            </w:tcMar>
+            <w:vAlign w:val="center"/>
+            <w:hideMark/>
+          </w:tcPr>
+          <w:p>
+            <w:pPr>
+              <w:spacing w:after="0" w:line="240" w:lineRule="auto"/>
+              <w:rPr>
+                <w:rFonts w:asciiTheme="majorHAnsi" w:eastAsia="Times New Roman" w:hAnsiTheme="majorHAnsi" w:cstheme="majorHAnsi"/>
+                <w:b/>
+                <w:bCs/>
+                <w:color w:val="003383"/>
+                <w:lang w:eastAsia="pt-BR"/>
+              </w:rPr>
+            </w:pPr>
+            <w:r>
+              <w:rPr>
+                <w:rFonts w:asciiTheme="majorHAnsi" w:eastAsia="Times New Roman" w:hAnsiTheme="majorHAnsi" w:cstheme="majorHAnsi"/>
+                <w:b/>
+                <w:bCs/>
+                <w:color w:val="003383"/>
+                <w:lang w:eastAsia="pt-BR"/>
+              </w:rPr>
+              <w:t>ID</w:t>
+            </w:r>
+          </w:p>
+        </w:tc>
+        <w:tc>
+          <w:tcPr>
+            <w:tcW w:w="3162" w:type="dxa"/>
+            <w:tcBorders>
+              <w:bottom w:val="single" w:sz="12" w:space="0" w:color="D9E4F2"/>
+            </w:tcBorders>
+            <w:shd w:val="clear" w:color="auto" w:fill="FFFFFF"/>
+            <w:tcMar>
+              <w:top w:w="135" w:type="dxa"/>
+              <w:left w:w="180" w:type="dxa"/>
+              <w:bottom w:w="135" w:type="dxa"/>
+              <w:right w:w="180" w:type="dxa"/>
+            </w:tcMar>
+            <w:vAlign w:val="center"/>
+            <w:hideMark/>
+          </w:tcPr>
+          <w:p>
+            <w:pPr>
+              <w:spacing w:after="0" w:line="240" w:lineRule="auto"/>
+              <w:rPr>
+                <w:rFonts w:asciiTheme="majorHAnsi" w:eastAsia="Times New Roman" w:hAnsiTheme="majorHAnsi" w:cstheme="majorHAnsi"/>
+                <w:b/>
+                <w:bCs/>
+                <w:color w:val="003383"/>
+                <w:lang w:eastAsia="pt-BR"/>
+              </w:rPr>
+            </w:pPr>
+            <w:r>
+              <w:rPr>
+                <w:rFonts w:asciiTheme="majorHAnsi" w:eastAsia="Times New Roman" w:hAnsiTheme="majorHAnsi" w:cstheme="majorHAnsi"/>
+                <w:b/>
+                <w:bCs/>
+                <w:color w:val="003383"/>
+                <w:lang w:eastAsia="pt-BR"/>
+              </w:rPr>
+              <w:t>Entregável</w:t>
+            </w:r>
+          </w:p>
+        </w:tc>
+        <w:tc>
+          <w:tcPr>
+            <w:tcW w:w="4774" w:type="dxa"/>
+            <w:tcBorders>
+              <w:bottom w:val="single" w:sz="12" w:space="0" w:color="D9E4F2"/>
+            </w:tcBorders>
+            <w:shd w:val="clear" w:color="auto" w:fill="FFFFFF"/>
+            <w:tcMar>
+              <w:top w:w="135" w:type="dxa"/>
+              <w:left w:w="180" w:type="dxa"/>
+              <w:bottom w:w="135" w:type="dxa"/>
+              <w:right w:w="180" w:type="dxa"/>
+            </w:tcMar>
+            <w:vAlign w:val="center"/>
+            <w:hideMark/>
+          </w:tcPr>
+          <w:p>
+            <w:pPr>
+              <w:spacing w:after="0" w:line="240" w:lineRule="auto"/>
+              <w:rPr>
+                <w:rFonts w:asciiTheme="majorHAnsi" w:eastAsia="Times New Roman" w:hAnsiTheme="majorHAnsi" w:cstheme="majorHAnsi"/>
+                <w:b/>
+                <w:bCs/>
+                <w:color w:val="003383"/>
+                <w:lang w:eastAsia="pt-BR"/>
+              </w:rPr>
+            </w:pPr>
+            <w:r>
+              <w:rPr>
+                <w:rFonts w:asciiTheme="majorHAnsi" w:eastAsia="Times New Roman" w:hAnsiTheme="majorHAnsi" w:cstheme="majorHAnsi"/>
+                <w:b/>
+                <w:bCs/>
+                <w:color w:val="003383"/>
+                <w:lang w:eastAsia="pt-BR"/>
+              </w:rPr>
+              <w:t>Feito quando</w:t>
+            </w:r>
+          </w:p>
+        </w:tc>
+        <w:tc>
+          <w:tcPr>
+            <w:tcW w:w="0" w:type="auto"/>
+            <w:tcBorders>
+              <w:bottom w:val="single" w:sz="12" w:space="0" w:color="D9E4F2"/>
+            </w:tcBorders>
+            <w:shd w:val="clear" w:color="auto" w:fill="FFFFFF"/>
+            <w:tcMar>
+              <w:top w:w="135" w:type="dxa"/>
+              <w:left w:w="180" w:type="dxa"/>
+              <w:bottom w:w="135" w:type="dxa"/>
+              <w:right w:w="180" w:type="dxa"/>
+            </w:tcMar>
+            <w:vAlign w:val="center"/>
+            <w:hideMark/>
+          </w:tcPr>
+          <w:p>
+            <w:pPr>
+              <w:spacing w:after="0" w:line="240" w:lineRule="auto"/>
+              <w:rPr>
+                <w:rFonts w:asciiTheme="majorHAnsi" w:eastAsia="Times New Roman" w:hAnsiTheme="majorHAnsi" w:cstheme="majorHAnsi"/>
+                <w:b/>
+                <w:bCs/>
+                <w:color w:val="003383"/>
+                <w:lang w:eastAsia="pt-BR"/>
+              </w:rPr>
+            </w:pPr>
+            <w:proofErr w:type="spellStart"/>
+            <w:r>
+              <w:rPr>
+                <w:rFonts w:asciiTheme="majorHAnsi" w:eastAsia="Times New Roman" w:hAnsiTheme="majorHAnsi" w:cstheme="majorHAnsi"/>
+                <w:b/>
+                <w:bCs/>
+                <w:color w:val="003383"/>
+                <w:lang w:eastAsia="pt-BR"/>
+              </w:rPr>
+              <w:t>Obj</w:t>
+            </w:r>
+            <w:proofErr w:type="spellEnd"/>
+            <w:r>
+              <w:rPr>
+                <w:rFonts w:asciiTheme="majorHAnsi" w:eastAsia="Times New Roman" w:hAnsiTheme="majorHAnsi" w:cstheme="majorHAnsi"/>
+                <w:b/>
+                <w:bCs/>
+                <w:color w:val="003383"/>
+                <w:lang w:eastAsia="pt-BR"/>
+              </w:rPr>
+              <w:t>.</w:t>
+            </w:r>
+          </w:p>
+        </w:tc>
+        <w:tc>
+          <w:tcPr>
+            <w:tcW w:w="0" w:type="auto"/>
+            <w:tcBorders>
+              <w:bottom w:val="single" w:sz="12" w:space="0" w:color="D9E4F2"/>
+            </w:tcBorders>
+            <w:shd w:val="clear" w:color="auto" w:fill="FFFFFF"/>
+            <w:tcMar>
+              <w:top w:w="135" w:type="dxa"/>
+              <w:left w:w="180" w:type="dxa"/>
+              <w:bottom w:w="135" w:type="dxa"/>
+              <w:right w:w="180" w:type="dxa"/>
+            </w:tcMar>
+            <w:vAlign w:val="center"/>
+            <w:hideMark/>
+          </w:tcPr>
+          <w:p>
+            <w:pPr>
+              <w:spacing w:after="0" w:line="240" w:lineRule="auto"/>
+              <w:rPr>
+                <w:rFonts w:asciiTheme="majorHAnsi" w:eastAsia="Times New Roman" w:hAnsiTheme="majorHAnsi" w:cstheme="majorHAnsi"/>
+                <w:b/>
+                <w:bCs/>
+                <w:color w:val="003383"/>
+                <w:lang w:eastAsia="pt-BR"/>
+              </w:rPr>
+            </w:pPr>
+            <w:r>
+              <w:rPr>
+                <w:rFonts w:asciiTheme="majorHAnsi" w:eastAsia="Times New Roman" w:hAnsiTheme="majorHAnsi" w:cstheme="majorHAnsi"/>
+                <w:b/>
+                <w:bCs/>
+                <w:color w:val="003383"/>
+                <w:lang w:eastAsia="pt-BR"/>
+              </w:rPr>
+              <w:t>Tam.</w:t>
+            </w:r>
+          </w:p>
+        </w:tc>
+      </w:tr>
+      <w:tr>
+        <w:trPr>
+          <w:trHeight w:val="144"/>
+          <w:tblHeader/>
+        </w:trPr>
+        <w:tc>
+          <w:tcPr>
+            <w:tcW w:w="0" w:type="auto"/>
+            <w:tcBorders>
+              <w:bottom w:val="single" w:sz="12" w:space="0" w:color="D9E4F2"/>
+            </w:tcBorders>
+            <w:shd w:val="clear" w:color="auto" w:fill="FFFFFF"/>
+            <w:tcMar>
+              <w:top w:w="135" w:type="dxa"/>
+              <w:left w:w="180" w:type="dxa"/>
+              <w:bottom w:w="135" w:type="dxa"/>
+              <w:right w:w="180" w:type="dxa"/>
+            </w:tcMar>
+            <w:vAlign w:val="center"/>
+          </w:tcPr>
+          <w:p>
+            <w:pPr>
+              <w:spacing w:after="0" w:line="240" w:lineRule="auto"/>
+              <w:rPr>
+                <w:rFonts w:asciiTheme="majorHAnsi" w:eastAsia="Times New Roman" w:hAnsiTheme="majorHAnsi" w:cstheme="majorHAnsi"/>
+                <w:bCs/>
+                <w:color w:val="auto"/>
+                <w:lang w:eastAsia="pt-BR"/>
+              </w:rPr>
+            </w:pPr>
+            <w:r>
+              <w:rPr>
+                <w:rFonts w:asciiTheme="majorHAnsi" w:eastAsia="Times New Roman" w:hAnsiTheme="majorHAnsi" w:cstheme="majorHAnsi"/>
+                <w:bCs/>
+                <w:color w:val="auto"/>
+                <w:lang w:eastAsia="pt-BR"/>
+              </w:rPr>
+              <w:t>E1</w:t>
+            </w:r>
+          </w:p>
+        </w:tc>
+        <w:tc>
+          <w:tcPr>
+            <w:tcW w:w="3162" w:type="dxa"/>
+            <w:tcBorders>
+              <w:bottom w:val="single" w:sz="12" w:space="0" w:color="D9E4F2"/>
+            </w:tcBorders>
+            <w:shd w:val="clear" w:color="auto" w:fill="FFFFFF"/>
+            <w:tcMar>
+              <w:top w:w="135" w:type="dxa"/>
+              <w:left w:w="180" w:type="dxa"/>
+              <w:bottom w:w="135" w:type="dxa"/>
+              <w:right w:w="180" w:type="dxa"/>
+            </w:tcMar>
+            <w:vAlign w:val="center"/>
+          </w:tcPr>
+          <w:p>
+            <w:pPr>
+              <w:spacing w:after="0" w:line="240" w:lineRule="auto"/>
+              <w:rPr>
+                <w:rFonts w:asciiTheme="majorHAnsi" w:eastAsia="Times New Roman" w:hAnsiTheme="majorHAnsi" w:cstheme="majorHAnsi"/>
+                <w:bCs/>
+                <w:color w:val="auto"/>
+                <w:lang w:eastAsia="pt-BR"/>
+              </w:rPr>
+            </w:pPr>
+            <w:r>
+              <w:rPr>
+                <w:rFonts w:asciiTheme="majorHAnsi" w:eastAsia="Calibri" w:hAnsiTheme="majorHAnsi" w:cstheme="majorHAnsi"/>
+                <w:color w:val="auto"/>
+              </w:rPr>
+              <w:t>Autenticar e restringir o acesso de registro de certificados</w:t>
+            </w:r>
+          </w:p>
+        </w:tc>
+        <w:tc>
+          <w:tcPr>
+            <w:tcW w:w="4774" w:type="dxa"/>
+            <w:tcBorders>
+              <w:bottom w:val="single" w:sz="12" w:space="0" w:color="D9E4F2"/>
+            </w:tcBorders>
+            <w:shd w:val="clear" w:color="auto" w:fill="FFFFFF"/>
+            <w:tcMar>
+              <w:top w:w="135" w:type="dxa"/>
+              <w:left w:w="180" w:type="dxa"/>
+              <w:bottom w:w="135" w:type="dxa"/>
+              <w:right w:w="180" w:type="dxa"/>
+            </w:tcMar>
+            <w:vAlign w:val="center"/>
+          </w:tcPr>
+          <w:p>
+            <w:pPr>
+              <w:spacing w:after="0" w:line="240" w:lineRule="auto"/>
+              <w:rPr>
+                <w:rFonts w:asciiTheme="majorHAnsi" w:eastAsia="Times New Roman" w:hAnsiTheme="majorHAnsi" w:cstheme="majorHAnsi"/>
+                <w:bCs/>
+                <w:color w:val="auto"/>
+                <w:lang w:eastAsia="pt-BR"/>
+              </w:rPr>
+            </w:pPr>
+            <w:r>
+              <w:rPr>
+                <w:rFonts w:asciiTheme="majorHAnsi" w:eastAsia="Times New Roman" w:hAnsiTheme="majorHAnsi" w:cstheme="majorHAnsi"/>
+                <w:bCs/>
+                <w:color w:val="auto"/>
+                <w:lang w:eastAsia="pt-BR"/>
+              </w:rPr>
+              <w:t>Há a tentativa de consulta de aluno ou alguma outra pessoa, fora a empresa emissora</w:t>
+            </w:r>
+          </w:p>
+        </w:tc>
+        <w:tc>
+          <w:tcPr>
+            <w:tcW w:w="0" w:type="auto"/>
+            <w:tcBorders>
+              <w:bottom w:val="single" w:sz="12" w:space="0" w:color="D9E4F2"/>
+            </w:tcBorders>
+            <w:shd w:val="clear" w:color="auto" w:fill="FFFFFF"/>
+            <w:tcMar>
+              <w:top w:w="135" w:type="dxa"/>
+              <w:left w:w="180" w:type="dxa"/>
+              <w:bottom w:w="135" w:type="dxa"/>
+              <w:right w:w="180" w:type="dxa"/>
+            </w:tcMar>
+            <w:vAlign w:val="center"/>
+          </w:tcPr>
+          <w:p>
+            <w:pPr>
+              <w:spacing w:after="0" w:line="240" w:lineRule="auto"/>
+              <w:rPr>
+                <w:rFonts w:asciiTheme="majorHAnsi" w:eastAsia="Times New Roman" w:hAnsiTheme="majorHAnsi" w:cstheme="majorHAnsi"/>
+                <w:bCs/>
+                <w:color w:val="auto"/>
+                <w:lang w:eastAsia="pt-BR"/>
+              </w:rPr>
+            </w:pPr>
+            <w:r>
+              <w:rPr>
+                <w:rFonts w:asciiTheme="majorHAnsi" w:eastAsia="Times New Roman" w:hAnsiTheme="majorHAnsi" w:cstheme="majorHAnsi"/>
+                <w:bCs/>
+                <w:color w:val="auto"/>
+                <w:lang w:eastAsia="pt-BR"/>
+              </w:rPr>
+              <w:t>OE1</w:t>
+            </w:r>
+          </w:p>
+        </w:tc>
+        <w:tc>
+          <w:tcPr>
+            <w:tcW w:w="0" w:type="auto"/>
+            <w:tcBorders>
+              <w:bottom w:val="single" w:sz="12" w:space="0" w:color="D9E4F2"/>
+            </w:tcBorders>
+            <w:shd w:val="clear" w:color="auto" w:fill="FFFFFF"/>
+            <w:tcMar>
+              <w:top w:w="135" w:type="dxa"/>
+              <w:left w:w="180" w:type="dxa"/>
+              <w:bottom w:w="135" w:type="dxa"/>
+              <w:right w:w="180" w:type="dxa"/>
+            </w:tcMar>
+            <w:vAlign w:val="center"/>
+          </w:tcPr>
+          <w:p>
+            <w:pPr>
+              <w:spacing w:after="0" w:line="240" w:lineRule="auto"/>
+              <w:rPr>
+                <w:rFonts w:asciiTheme="majorHAnsi" w:eastAsia="Times New Roman" w:hAnsiTheme="majorHAnsi" w:cstheme="majorHAnsi"/>
+                <w:bCs/>
+                <w:color w:val="auto"/>
+                <w:lang w:eastAsia="pt-BR"/>
+              </w:rPr>
+            </w:pPr>
+            <w:r>
+              <w:rPr>
+                <w:rFonts w:asciiTheme="majorHAnsi" w:eastAsia="Times New Roman" w:hAnsiTheme="majorHAnsi" w:cstheme="majorHAnsi"/>
+                <w:bCs/>
+                <w:color w:val="auto"/>
+                <w:lang w:eastAsia="pt-BR"/>
+              </w:rPr>
+              <w:t>M</w:t>
+            </w:r>
+          </w:p>
+        </w:tc>
+      </w:tr>
+      <w:tr>
+        <w:trPr>
+          <w:trHeight w:val="144"/>
+          <w:tblHeader/>
+        </w:trPr>
+        <w:tc>
+          <w:tcPr>
+            <w:tcW w:w="0" w:type="auto"/>
+            <w:tcBorders>
+              <w:bottom w:val="single" w:sz="12" w:space="0" w:color="D9E4F2"/>
+            </w:tcBorders>
+            <w:shd w:val="clear" w:color="auto" w:fill="FFFFFF"/>
+            <w:tcMar>
+              <w:top w:w="135" w:type="dxa"/>
+              <w:left w:w="180" w:type="dxa"/>
+              <w:bottom w:w="135" w:type="dxa"/>
+              <w:right w:w="180" w:type="dxa"/>
+            </w:tcMar>
+            <w:vAlign w:val="center"/>
+          </w:tcPr>
+          <w:p>
+            <w:pPr>
+              <w:spacing w:after="0" w:line="240" w:lineRule="auto"/>
+              <w:rPr>
+                <w:rFonts w:asciiTheme="majorHAnsi" w:eastAsia="Times New Roman" w:hAnsiTheme="majorHAnsi" w:cstheme="majorHAnsi"/>
+                <w:bCs/>
+                <w:color w:val="auto"/>
+                <w:lang w:eastAsia="pt-BR"/>
+              </w:rPr>
+            </w:pPr>
+            <w:r>
+              <w:rPr>
+                <w:rFonts w:asciiTheme="majorHAnsi" w:eastAsia="Times New Roman" w:hAnsiTheme="majorHAnsi" w:cstheme="majorHAnsi"/>
+                <w:bCs/>
+                <w:color w:val="auto"/>
+                <w:lang w:eastAsia="pt-BR"/>
+              </w:rPr>
+              <w:t>E2</w:t>
+            </w:r>
+          </w:p>
+        </w:tc>
+        <w:tc>
+          <w:tcPr>
+            <w:tcW w:w="3162" w:type="dxa"/>
+            <w:tcBorders>
+              <w:bottom w:val="single" w:sz="12" w:space="0" w:color="D9E4F2"/>
+            </w:tcBorders>
+            <w:shd w:val="clear" w:color="auto" w:fill="FFFFFF"/>
+            <w:tcMar>
+              <w:top w:w="135" w:type="dxa"/>
+              <w:left w:w="180" w:type="dxa"/>
+              <w:bottom w:w="135" w:type="dxa"/>
+              <w:right w:w="180" w:type="dxa"/>
+            </w:tcMar>
+            <w:vAlign w:val="center"/>
+          </w:tcPr>
+          <w:p>
+            <w:pPr>
+              <w:spacing w:after="0" w:line="240" w:lineRule="auto"/>
+              <w:rPr>
+                <w:rFonts w:asciiTheme="majorHAnsi" w:eastAsia="Times New Roman" w:hAnsiTheme="majorHAnsi" w:cstheme="majorHAnsi"/>
+                <w:bCs/>
+                <w:color w:val="auto"/>
+                <w:lang w:eastAsia="pt-BR"/>
+              </w:rPr>
+            </w:pPr>
+            <w:r>
+              <w:rPr>
+                <w:rFonts w:asciiTheme="majorHAnsi" w:eastAsia="Calibri" w:hAnsiTheme="majorHAnsi" w:cstheme="majorHAnsi"/>
+                <w:color w:val="auto"/>
+              </w:rPr>
+              <w:t>Registrar os certificados</w:t>
+            </w:r>
+          </w:p>
+        </w:tc>
+        <w:tc>
+          <w:tcPr>
+            <w:tcW w:w="4774" w:type="dxa"/>
+            <w:tcBorders>
+              <w:bottom w:val="single" w:sz="12" w:space="0" w:color="D9E4F2"/>
+            </w:tcBorders>
+            <w:shd w:val="clear" w:color="auto" w:fill="FFFFFF"/>
+            <w:tcMar>
+              <w:top w:w="135" w:type="dxa"/>
+              <w:left w:w="180" w:type="dxa"/>
+              <w:bottom w:w="135" w:type="dxa"/>
+              <w:right w:w="180" w:type="dxa"/>
+            </w:tcMar>
+            <w:vAlign w:val="center"/>
+          </w:tcPr>
+          <w:p>
+            <w:pPr>
+              <w:spacing w:after="0" w:line="240" w:lineRule="auto"/>
+              <w:rPr>
+                <w:rFonts w:asciiTheme="majorHAnsi" w:eastAsia="Times New Roman" w:hAnsiTheme="majorHAnsi" w:cstheme="majorHAnsi"/>
+                <w:bCs/>
+                <w:color w:val="auto"/>
+                <w:lang w:eastAsia="pt-BR"/>
+              </w:rPr>
+            </w:pPr>
+            <w:r>
+              <w:rPr>
+                <w:rFonts w:asciiTheme="majorHAnsi" w:eastAsia="Times New Roman" w:hAnsiTheme="majorHAnsi" w:cstheme="majorHAnsi"/>
+                <w:bCs/>
+                <w:color w:val="auto"/>
+                <w:lang w:eastAsia="pt-BR"/>
+              </w:rPr>
+              <w:t>A empresa já está cadastrada e um aluno encerra o curso</w:t>
+            </w:r>
+          </w:p>
+        </w:tc>
+        <w:tc>
+          <w:tcPr>
+            <w:tcW w:w="0" w:type="auto"/>
+            <w:tcBorders>
+              <w:bottom w:val="single" w:sz="12" w:space="0" w:color="D9E4F2"/>
+            </w:tcBorders>
+            <w:shd w:val="clear" w:color="auto" w:fill="FFFFFF"/>
+            <w:tcMar>
+              <w:top w:w="135" w:type="dxa"/>
+              <w:left w:w="180" w:type="dxa"/>
+              <w:bottom w:w="135" w:type="dxa"/>
+              <w:right w:w="180" w:type="dxa"/>
+            </w:tcMar>
+            <w:vAlign w:val="center"/>
+          </w:tcPr>
+          <w:p>
+            <w:pPr>
+              <w:spacing w:after="0" w:line="240" w:lineRule="auto"/>
+              <w:rPr>
+                <w:rFonts w:asciiTheme="majorHAnsi" w:eastAsia="Times New Roman" w:hAnsiTheme="majorHAnsi" w:cstheme="majorHAnsi"/>
+                <w:bCs/>
+                <w:color w:val="auto"/>
+                <w:lang w:eastAsia="pt-BR"/>
+              </w:rPr>
+            </w:pPr>
+            <w:r>
+              <w:rPr>
+                <w:rFonts w:asciiTheme="majorHAnsi" w:eastAsia="Times New Roman" w:hAnsiTheme="majorHAnsi" w:cstheme="majorHAnsi"/>
+                <w:bCs/>
+                <w:color w:val="auto"/>
+                <w:lang w:eastAsia="pt-BR"/>
+              </w:rPr>
+              <w:t>OE2</w:t>
+            </w:r>
+          </w:p>
+        </w:tc>
+        <w:tc>
+          <w:tcPr>
+            <w:tcW w:w="0" w:type="auto"/>
+            <w:tcBorders>
+              <w:bottom w:val="single" w:sz="12" w:space="0" w:color="D9E4F2"/>
+            </w:tcBorders>
+            <w:shd w:val="clear" w:color="auto" w:fill="FFFFFF"/>
+            <w:tcMar>
+              <w:top w:w="135" w:type="dxa"/>
+              <w:left w:w="180" w:type="dxa"/>
+              <w:bottom w:w="135" w:type="dxa"/>
+              <w:right w:w="180" w:type="dxa"/>
+            </w:tcMar>
+            <w:vAlign w:val="center"/>
+          </w:tcPr>
+          <w:p>
+            <w:pPr>
+              <w:spacing w:after="0" w:line="240" w:lineRule="auto"/>
+              <w:rPr>
+                <w:rFonts w:asciiTheme="majorHAnsi" w:eastAsia="Times New Roman" w:hAnsiTheme="majorHAnsi" w:cstheme="majorHAnsi"/>
+                <w:bCs/>
+                <w:color w:val="auto"/>
+                <w:lang w:eastAsia="pt-BR"/>
+              </w:rPr>
+            </w:pPr>
+            <w:r>
+              <w:rPr>
+                <w:rFonts w:asciiTheme="majorHAnsi" w:eastAsia="Times New Roman" w:hAnsiTheme="majorHAnsi" w:cstheme="majorHAnsi"/>
+                <w:bCs/>
+                <w:color w:val="auto"/>
+                <w:lang w:eastAsia="pt-BR"/>
+              </w:rPr>
+              <w:t>G</w:t>
+            </w:r>
+          </w:p>
+        </w:tc>
+      </w:tr>
+      <w:tr>
+        <w:trPr>
+          <w:trHeight w:val="144"/>
+          <w:tblHeader/>
+        </w:trPr>
+        <w:tc>
+          <w:tcPr>
+            <w:tcW w:w="0" w:type="auto"/>
+            <w:tcBorders>
+              <w:bottom w:val="single" w:sz="12" w:space="0" w:color="D9E4F2"/>
+            </w:tcBorders>
+            <w:shd w:val="clear" w:color="auto" w:fill="FFFFFF"/>
+            <w:tcMar>
+              <w:top w:w="135" w:type="dxa"/>
+              <w:left w:w="180" w:type="dxa"/>
+              <w:bottom w:w="135" w:type="dxa"/>
+              <w:right w:w="180" w:type="dxa"/>
+            </w:tcMar>
+            <w:vAlign w:val="center"/>
+          </w:tcPr>
+          <w:p>
+            <w:pPr>
+              <w:spacing w:after="0" w:line="240" w:lineRule="auto"/>
+              <w:rPr>
+                <w:rFonts w:asciiTheme="majorHAnsi" w:eastAsia="Times New Roman" w:hAnsiTheme="majorHAnsi" w:cstheme="majorHAnsi"/>
+                <w:bCs/>
+                <w:color w:val="auto"/>
+                <w:lang w:eastAsia="pt-BR"/>
+              </w:rPr>
+            </w:pPr>
+            <w:r>
+              <w:rPr>
+                <w:rFonts w:asciiTheme="majorHAnsi" w:eastAsia="Times New Roman" w:hAnsiTheme="majorHAnsi" w:cstheme="majorHAnsi"/>
+                <w:bCs/>
+                <w:color w:val="auto"/>
+                <w:lang w:eastAsia="pt-BR"/>
+              </w:rPr>
+              <w:t>E3</w:t>
+            </w:r>
+          </w:p>
+        </w:tc>
+        <w:tc>
+          <w:tcPr>
+            <w:tcW w:w="3162" w:type="dxa"/>
+            <w:tcBorders>
+              <w:bottom w:val="single" w:sz="12" w:space="0" w:color="D9E4F2"/>
+            </w:tcBorders>
+            <w:shd w:val="clear" w:color="auto" w:fill="FFFFFF"/>
+            <w:tcMar>
+              <w:top w:w="135" w:type="dxa"/>
+              <w:left w:w="180" w:type="dxa"/>
+              <w:bottom w:w="135" w:type="dxa"/>
+              <w:right w:w="180" w:type="dxa"/>
+            </w:tcMar>
+            <w:vAlign w:val="center"/>
+          </w:tcPr>
+          <w:p>
+            <w:pPr>
+              <w:spacing w:after="0" w:line="240" w:lineRule="auto"/>
+              <w:rPr>
+                <w:rFonts w:asciiTheme="majorHAnsi" w:eastAsia="Times New Roman" w:hAnsiTheme="majorHAnsi" w:cstheme="majorHAnsi"/>
+                <w:bCs/>
+                <w:color w:val="auto"/>
+                <w:lang w:eastAsia="pt-BR"/>
+              </w:rPr>
+            </w:pPr>
+            <w:r>
+              <w:rPr>
+                <w:rFonts w:asciiTheme="majorHAnsi" w:eastAsia="Calibri" w:hAnsiTheme="majorHAnsi" w:cstheme="majorHAnsi"/>
+                <w:color w:val="auto"/>
+              </w:rPr>
+              <w:t>Disponibilizar uma interface de consulta pública</w:t>
+            </w:r>
+          </w:p>
+        </w:tc>
+        <w:tc>
+          <w:tcPr>
+            <w:tcW w:w="4774" w:type="dxa"/>
+            <w:tcBorders>
+              <w:bottom w:val="single" w:sz="12" w:space="0" w:color="D9E4F2"/>
+            </w:tcBorders>
+            <w:shd w:val="clear" w:color="auto" w:fill="FFFFFF"/>
+            <w:tcMar>
+              <w:top w:w="135" w:type="dxa"/>
+              <w:left w:w="180" w:type="dxa"/>
+              <w:bottom w:w="135" w:type="dxa"/>
+              <w:right w:w="180" w:type="dxa"/>
+            </w:tcMar>
+            <w:vAlign w:val="center"/>
+          </w:tcPr>
+          <w:p>
+            <w:pPr>
+              <w:spacing w:after="0" w:line="240" w:lineRule="auto"/>
+              <w:rPr>
+                <w:rFonts w:asciiTheme="majorHAnsi" w:eastAsia="Times New Roman" w:hAnsiTheme="majorHAnsi" w:cstheme="majorHAnsi"/>
+                <w:bCs/>
+                <w:color w:val="auto"/>
+                <w:lang w:eastAsia="pt-BR"/>
+              </w:rPr>
+            </w:pPr>
+            <w:r>
+              <w:rPr>
+                <w:rFonts w:asciiTheme="majorHAnsi" w:eastAsia="Times New Roman" w:hAnsiTheme="majorHAnsi" w:cstheme="majorHAnsi"/>
+                <w:bCs/>
+                <w:color w:val="auto"/>
+                <w:lang w:eastAsia="pt-BR"/>
+              </w:rPr>
+              <w:t xml:space="preserve">Alguma pessoa decide consultar a credibilidade de um certificado com </w:t>
+            </w:r>
+            <w:r>
+              <w:rPr>
+                <w:rFonts w:asciiTheme="majorHAnsi" w:eastAsia="Times New Roman" w:hAnsiTheme="majorHAnsi" w:cstheme="majorHAnsi"/>
+                <w:bCs/>
+                <w:color w:val="auto"/>
+                <w:lang w:eastAsia="pt-BR"/>
+              </w:rPr>
+              <w:t>a chave de autenticação</w:t>
+            </w:r>
+          </w:p>
+        </w:tc>
+        <w:tc>
+          <w:tcPr>
+            <w:tcW w:w="0" w:type="auto"/>
+            <w:tcBorders>
+              <w:bottom w:val="single" w:sz="12" w:space="0" w:color="D9E4F2"/>
+            </w:tcBorders>
+            <w:shd w:val="clear" w:color="auto" w:fill="FFFFFF"/>
+            <w:tcMar>
+              <w:top w:w="135" w:type="dxa"/>
+              <w:left w:w="180" w:type="dxa"/>
+              <w:bottom w:w="135" w:type="dxa"/>
+              <w:right w:w="180" w:type="dxa"/>
+            </w:tcMar>
+            <w:vAlign w:val="center"/>
+          </w:tcPr>
+          <w:p>
+            <w:pPr>
+              <w:spacing w:after="0" w:line="240" w:lineRule="auto"/>
+              <w:rPr>
+                <w:rFonts w:asciiTheme="majorHAnsi" w:eastAsia="Times New Roman" w:hAnsiTheme="majorHAnsi" w:cstheme="majorHAnsi"/>
+                <w:bCs/>
+                <w:color w:val="auto"/>
+                <w:lang w:eastAsia="pt-BR"/>
+              </w:rPr>
+            </w:pPr>
+            <w:r>
+              <w:rPr>
+                <w:rFonts w:asciiTheme="majorHAnsi" w:eastAsia="Times New Roman" w:hAnsiTheme="majorHAnsi" w:cstheme="majorHAnsi"/>
+                <w:bCs/>
+                <w:color w:val="auto"/>
+                <w:lang w:eastAsia="pt-BR"/>
+              </w:rPr>
+              <w:t>OE3</w:t>
+            </w:r>
+          </w:p>
+        </w:tc>
+        <w:tc>
+          <w:tcPr>
+            <w:tcW w:w="0" w:type="auto"/>
+            <w:tcBorders>
+              <w:bottom w:val="single" w:sz="12" w:space="0" w:color="D9E4F2"/>
+            </w:tcBorders>
+            <w:shd w:val="clear" w:color="auto" w:fill="FFFFFF"/>
+            <w:tcMar>
+              <w:top w:w="135" w:type="dxa"/>
+              <w:left w:w="180" w:type="dxa"/>
+              <w:bottom w:w="135" w:type="dxa"/>
+              <w:right w:w="180" w:type="dxa"/>
+            </w:tcMar>
+            <w:vAlign w:val="center"/>
+          </w:tcPr>
+          <w:p>
+            <w:pPr>
+              <w:spacing w:after="0" w:line="240" w:lineRule="auto"/>
+              <w:rPr>
+                <w:rFonts w:asciiTheme="majorHAnsi" w:eastAsia="Times New Roman" w:hAnsiTheme="majorHAnsi" w:cstheme="majorHAnsi"/>
+                <w:bCs/>
+                <w:color w:val="auto"/>
+                <w:lang w:eastAsia="pt-BR"/>
+              </w:rPr>
+            </w:pPr>
+            <w:r>
+              <w:rPr>
+                <w:rFonts w:asciiTheme="majorHAnsi" w:eastAsia="Times New Roman" w:hAnsiTheme="majorHAnsi" w:cstheme="majorHAnsi"/>
+                <w:bCs/>
+                <w:color w:val="auto"/>
+                <w:lang w:eastAsia="pt-BR"/>
+              </w:rPr>
+              <w:t>P</w:t>
+            </w:r>
+          </w:p>
+        </w:tc>
+      </w:tr>
+      <w:tr>
+        <w:trPr>
+          <w:trHeight w:val="458"/>
+        </w:trPr>
+        <w:tc>
+          <w:tcPr>
+            <w:tcW w:w="0" w:type="auto"/>
+            <w:tcBorders>
+              <w:bottom w:val="single" w:sz="6" w:space="0" w:color="D9E4F2"/>
+            </w:tcBorders>
+            <w:shd w:val="clear" w:color="auto" w:fill="FFFFFF"/>
+            <w:tcMar>
+              <w:top w:w="135" w:type="dxa"/>
+              <w:left w:w="180" w:type="dxa"/>
+              <w:bottom w:w="135" w:type="dxa"/>
+              <w:right w:w="180" w:type="dxa"/>
+            </w:tcMar>
+            <w:vAlign w:val="center"/>
+            <w:hideMark/>
+          </w:tcPr>
+          <w:p>
+            <w:pPr>
+              <w:spacing w:after="0" w:line="240" w:lineRule="auto"/>
+              <w:rPr>
+                <w:rFonts w:asciiTheme="majorHAnsi" w:eastAsia="Times New Roman" w:hAnsiTheme="majorHAnsi" w:cstheme="majorHAnsi"/>
+                <w:color w:val="auto"/>
+                <w:lang w:eastAsia="pt-BR"/>
+              </w:rPr>
+            </w:pPr>
+            <w:r>
+              <w:rPr>
+                <w:rFonts w:asciiTheme="majorHAnsi" w:eastAsia="Times New Roman" w:hAnsiTheme="majorHAnsi" w:cstheme="majorHAnsi"/>
+                <w:color w:val="auto"/>
+                <w:lang w:eastAsia="pt-BR"/>
+              </w:rPr>
+              <w:t>E</w:t>
+            </w:r>
+            <w:r>
+              <w:rPr>
+                <w:rFonts w:asciiTheme="majorHAnsi" w:eastAsia="Times New Roman" w:hAnsiTheme="majorHAnsi" w:cstheme="majorHAnsi"/>
+                <w:color w:val="auto"/>
+                <w:lang w:eastAsia="pt-BR"/>
+              </w:rPr>
+              <w:t>4</w:t>
+            </w:r>
+          </w:p>
+        </w:tc>
+        <w:tc>
+          <w:tcPr>
+            <w:tcW w:w="3162" w:type="dxa"/>
+            <w:tcBorders>
+              <w:bottom w:val="single" w:sz="6" w:space="0" w:color="D9E4F2"/>
+            </w:tcBorders>
+            <w:shd w:val="clear" w:color="auto" w:fill="FFFFFF"/>
+            <w:tcMar>
+              <w:top w:w="135" w:type="dxa"/>
+              <w:left w:w="180" w:type="dxa"/>
+              <w:bottom w:w="135" w:type="dxa"/>
+              <w:right w:w="180" w:type="dxa"/>
+            </w:tcMar>
+            <w:vAlign w:val="center"/>
+            <w:hideMark/>
+          </w:tcPr>
+          <w:p>
+            <w:pPr>
+              <w:spacing w:after="0" w:line="240" w:lineRule="auto"/>
+              <w:rPr>
+                <w:rFonts w:asciiTheme="majorHAnsi" w:eastAsia="Times New Roman" w:hAnsiTheme="majorHAnsi" w:cstheme="majorHAnsi"/>
+                <w:color w:val="auto"/>
+                <w:lang w:eastAsia="pt-BR"/>
+              </w:rPr>
+            </w:pPr>
+            <w:r>
+              <w:rPr>
+                <w:rFonts w:asciiTheme="majorHAnsi" w:eastAsia="Calibri" w:hAnsiTheme="majorHAnsi" w:cstheme="majorHAnsi"/>
+                <w:color w:val="auto"/>
+              </w:rPr>
+              <w:t>Manter um painel de histórico para o emissor</w:t>
+            </w:r>
+          </w:p>
+        </w:tc>
+        <w:tc>
+          <w:tcPr>
+            <w:tcW w:w="4774" w:type="dxa"/>
+            <w:tcBorders>
+              <w:bottom w:val="single" w:sz="6" w:space="0" w:color="D9E4F2"/>
+            </w:tcBorders>
+            <w:shd w:val="clear" w:color="auto" w:fill="FFFFFF"/>
+            <w:tcMar>
+              <w:top w:w="135" w:type="dxa"/>
+              <w:left w:w="180" w:type="dxa"/>
+              <w:bottom w:w="135" w:type="dxa"/>
+              <w:right w:w="180" w:type="dxa"/>
+            </w:tcMar>
+            <w:vAlign w:val="center"/>
+            <w:hideMark/>
+          </w:tcPr>
+          <w:p>
+            <w:pPr>
+              <w:spacing w:after="0" w:line="240" w:lineRule="auto"/>
+              <w:rPr>
+                <w:rFonts w:asciiTheme="majorHAnsi" w:eastAsia="Times New Roman" w:hAnsiTheme="majorHAnsi" w:cstheme="majorHAnsi"/>
+                <w:color w:val="auto"/>
+                <w:lang w:eastAsia="pt-BR"/>
+              </w:rPr>
+            </w:pPr>
+            <w:r>
+              <w:rPr>
+                <w:rFonts w:asciiTheme="majorHAnsi" w:eastAsia="Times New Roman" w:hAnsiTheme="majorHAnsi" w:cstheme="majorHAnsi"/>
+                <w:color w:val="auto"/>
+                <w:lang w:eastAsia="pt-BR"/>
+              </w:rPr>
+              <w:t>A partir do momento que a empresa é cadastrada e insere o primeiro certificado</w:t>
+            </w:r>
+          </w:p>
+        </w:tc>
+        <w:tc>
+          <w:tcPr>
+            <w:tcW w:w="0" w:type="auto"/>
+            <w:tcBorders>
+              <w:bottom w:val="single" w:sz="6" w:space="0" w:color="D9E4F2"/>
+            </w:tcBorders>
+            <w:shd w:val="clear" w:color="auto" w:fill="FFFFFF"/>
+            <w:tcMar>
+              <w:top w:w="135" w:type="dxa"/>
+              <w:left w:w="180" w:type="dxa"/>
+              <w:bottom w:w="135" w:type="dxa"/>
+              <w:right w:w="180" w:type="dxa"/>
+            </w:tcMar>
+            <w:vAlign w:val="center"/>
+            <w:hideMark/>
+          </w:tcPr>
+          <w:p>
+            <w:pPr>
+              <w:spacing w:after="0" w:line="240" w:lineRule="auto"/>
+              <w:rPr>
+                <w:rFonts w:asciiTheme="majorHAnsi" w:eastAsia="Times New Roman" w:hAnsiTheme="majorHAnsi" w:cstheme="majorHAnsi"/>
+                <w:color w:val="auto"/>
+                <w:lang w:eastAsia="pt-BR"/>
+              </w:rPr>
+            </w:pPr>
+            <w:r>
+              <w:rPr>
+                <w:rFonts w:asciiTheme="majorHAnsi" w:eastAsia="Times New Roman" w:hAnsiTheme="majorHAnsi" w:cstheme="majorHAnsi"/>
+                <w:color w:val="auto"/>
+                <w:lang w:eastAsia="pt-BR"/>
+              </w:rPr>
+              <w:t>OE4</w:t>
+            </w:r>
+          </w:p>
+        </w:tc>
+        <w:tc>
+          <w:tcPr>
+            <w:tcW w:w="0" w:type="auto"/>
+            <w:tcBorders>
+              <w:bottom w:val="single" w:sz="6" w:space="0" w:color="D9E4F2"/>
+            </w:tcBorders>
+            <w:shd w:val="clear" w:color="auto" w:fill="FFFFFF"/>
+            <w:tcMar>
+              <w:top w:w="135" w:type="dxa"/>
+              <w:left w:w="180" w:type="dxa"/>
+              <w:bottom w:w="135" w:type="dxa"/>
+              <w:right w:w="180" w:type="dxa"/>
+            </w:tcMar>
+            <w:vAlign w:val="center"/>
+            <w:hideMark/>
+          </w:tcPr>
+          <w:p>
+            <w:pPr>
+              <w:spacing w:after="0" w:line="240" w:lineRule="auto"/>
+              <w:rPr>
+                <w:rFonts w:asciiTheme="majorHAnsi" w:eastAsia="Times New Roman" w:hAnsiTheme="majorHAnsi" w:cstheme="majorHAnsi"/>
+                <w:color w:val="auto"/>
+                <w:lang w:eastAsia="pt-BR"/>
+              </w:rPr>
+            </w:pPr>
+            <w:r>
+              <w:rPr>
+                <w:rFonts w:asciiTheme="majorHAnsi" w:eastAsia="Times New Roman" w:hAnsiTheme="majorHAnsi" w:cstheme="majorHAnsi"/>
+                <w:color w:val="auto"/>
+                <w:lang w:eastAsia="pt-BR"/>
+              </w:rPr>
+              <w:t>G</w:t>
+            </w:r>
+          </w:p>
+        </w:tc>
+      </w:tr>
+    </w:tbl>
     <w:p>
       <w:pPr>
         <w:spacing w:after="240"/>
+        <w:rPr>
+          <w:rFonts w:asciiTheme="majorHAnsi" w:hAnsiTheme="majorHAnsi" w:cstheme="majorHAnsi"/>
+          <w:color w:val="auto"/>
+        </w:rPr>
       </w:pPr>
-      <w:r>
-        <w:t>(O que exatamente vai existir em dezembro)</w:t>
-      </w:r>
     </w:p>
     <w:p>
       <w:pPr>
@@ -616,13 +1599,271 @@
         <w:t>Fora de Escopo</w:t>
       </w:r>
     </w:p>
+    <w:tbl>
+      <w:tblPr>
+        <w:tblW w:w="9673" w:type="dxa"/>
+        <w:shd w:val="clear" w:color="auto" w:fill="FFFFFF"/>
+        <w:tblCellMar>
+          <w:top w:w="15" w:type="dxa"/>
+          <w:left w:w="15" w:type="dxa"/>
+          <w:bottom w:w="15" w:type="dxa"/>
+          <w:right w:w="15" w:type="dxa"/>
+        </w:tblCellMar>
+        <w:tblLook w:val="04A0" w:firstRow="1" w:lastRow="0" w:firstColumn="1" w:lastColumn="0" w:noHBand="0" w:noVBand="1"/>
+      </w:tblPr>
+      <w:tblGrid>
+        <w:gridCol w:w="2061"/>
+        <w:gridCol w:w="7612"/>
+      </w:tblGrid>
+      <w:tr>
+        <w:trPr>
+          <w:trHeight w:val="522"/>
+          <w:tblHeader/>
+        </w:trPr>
+        <w:tc>
+          <w:tcPr>
+            <w:tcW w:w="0" w:type="auto"/>
+            <w:tcBorders>
+              <w:bottom w:val="single" w:sz="12" w:space="0" w:color="D9E4F2"/>
+            </w:tcBorders>
+            <w:shd w:val="clear" w:color="auto" w:fill="FFFFFF"/>
+            <w:tcMar>
+              <w:top w:w="135" w:type="dxa"/>
+              <w:left w:w="180" w:type="dxa"/>
+              <w:bottom w:w="135" w:type="dxa"/>
+              <w:right w:w="180" w:type="dxa"/>
+            </w:tcMar>
+            <w:vAlign w:val="center"/>
+            <w:hideMark/>
+          </w:tcPr>
+          <w:p>
+            <w:pPr>
+              <w:spacing w:after="240"/>
+              <w:rPr>
+                <w:b/>
+                <w:bCs/>
+              </w:rPr>
+            </w:pPr>
+            <w:r>
+              <w:rPr>
+                <w:b/>
+                <w:bCs/>
+              </w:rPr>
+              <w:t>O que fica de fora</w:t>
+            </w:r>
+          </w:p>
+        </w:tc>
+        <w:tc>
+          <w:tcPr>
+            <w:tcW w:w="0" w:type="auto"/>
+            <w:tcBorders>
+              <w:bottom w:val="single" w:sz="12" w:space="0" w:color="D9E4F2"/>
+            </w:tcBorders>
+            <w:shd w:val="clear" w:color="auto" w:fill="FFFFFF"/>
+            <w:tcMar>
+              <w:top w:w="135" w:type="dxa"/>
+              <w:left w:w="180" w:type="dxa"/>
+              <w:bottom w:w="135" w:type="dxa"/>
+              <w:right w:w="180" w:type="dxa"/>
+            </w:tcMar>
+            <w:vAlign w:val="center"/>
+            <w:hideMark/>
+          </w:tcPr>
+          <w:p>
+            <w:pPr>
+              <w:spacing w:after="240"/>
+              <w:rPr>
+                <w:b/>
+                <w:bCs/>
+              </w:rPr>
+            </w:pPr>
+            <w:r>
+              <w:rPr>
+                <w:b/>
+                <w:bCs/>
+              </w:rPr>
+              <w:t>Por quê</w:t>
+            </w:r>
+          </w:p>
+        </w:tc>
+      </w:tr>
+      <w:tr>
+        <w:trPr>
+          <w:trHeight w:val="1087"/>
+          <w:tblHeader/>
+        </w:trPr>
+        <w:tc>
+          <w:tcPr>
+            <w:tcW w:w="0" w:type="auto"/>
+            <w:tcBorders>
+              <w:bottom w:val="single" w:sz="12" w:space="0" w:color="D9E4F2"/>
+            </w:tcBorders>
+            <w:shd w:val="clear" w:color="auto" w:fill="FFFFFF"/>
+            <w:tcMar>
+              <w:top w:w="135" w:type="dxa"/>
+              <w:left w:w="180" w:type="dxa"/>
+              <w:bottom w:w="135" w:type="dxa"/>
+              <w:right w:w="180" w:type="dxa"/>
+            </w:tcMar>
+            <w:vAlign w:val="center"/>
+          </w:tcPr>
+          <w:p>
+            <w:pPr>
+              <w:spacing w:after="240"/>
+            </w:pPr>
+            <w:r>
+              <w:t>Validar documentos de identidade</w:t>
+            </w:r>
+          </w:p>
+        </w:tc>
+        <w:tc>
+          <w:tcPr>
+            <w:tcW w:w="0" w:type="auto"/>
+            <w:tcBorders>
+              <w:bottom w:val="single" w:sz="12" w:space="0" w:color="D9E4F2"/>
+            </w:tcBorders>
+            <w:shd w:val="clear" w:color="auto" w:fill="FFFFFF"/>
+            <w:tcMar>
+              <w:top w:w="135" w:type="dxa"/>
+              <w:left w:w="180" w:type="dxa"/>
+              <w:bottom w:w="135" w:type="dxa"/>
+              <w:right w:w="180" w:type="dxa"/>
+            </w:tcMar>
+            <w:vAlign w:val="center"/>
+          </w:tcPr>
+          <w:p>
+            <w:pPr>
+              <w:spacing w:after="240"/>
+            </w:pPr>
+            <w:r>
+              <w:t>Porque nosso objetivo é validar certificados e seria uma outra vertente validar outros documentos, como o de identidade.</w:t>
+            </w:r>
+          </w:p>
+        </w:tc>
+      </w:tr>
+      <w:tr>
+        <w:trPr>
+          <w:trHeight w:val="1101"/>
+          <w:tblHeader/>
+        </w:trPr>
+        <w:tc>
+          <w:tcPr>
+            <w:tcW w:w="0" w:type="auto"/>
+            <w:tcBorders>
+              <w:bottom w:val="single" w:sz="12" w:space="0" w:color="D9E4F2"/>
+            </w:tcBorders>
+            <w:shd w:val="clear" w:color="auto" w:fill="FFFFFF"/>
+            <w:tcMar>
+              <w:top w:w="135" w:type="dxa"/>
+              <w:left w:w="180" w:type="dxa"/>
+              <w:bottom w:w="135" w:type="dxa"/>
+              <w:right w:w="180" w:type="dxa"/>
+            </w:tcMar>
+            <w:vAlign w:val="center"/>
+          </w:tcPr>
+          <w:p>
+            <w:pPr>
+              <w:spacing w:after="240"/>
+            </w:pPr>
+            <w:r>
+              <w:t>Emissão de certificados</w:t>
+            </w:r>
+          </w:p>
+        </w:tc>
+        <w:tc>
+          <w:tcPr>
+            <w:tcW w:w="0" w:type="auto"/>
+            <w:tcBorders>
+              <w:bottom w:val="single" w:sz="12" w:space="0" w:color="D9E4F2"/>
+            </w:tcBorders>
+            <w:shd w:val="clear" w:color="auto" w:fill="FFFFFF"/>
+            <w:tcMar>
+              <w:top w:w="135" w:type="dxa"/>
+              <w:left w:w="180" w:type="dxa"/>
+              <w:bottom w:w="135" w:type="dxa"/>
+              <w:right w:w="180" w:type="dxa"/>
+            </w:tcMar>
+            <w:vAlign w:val="center"/>
+          </w:tcPr>
+          <w:p>
+            <w:pPr>
+              <w:spacing w:after="240"/>
+            </w:pPr>
+            <w:r>
+              <w:t>Porque emitir certificados significaria resolver um outro problema e a padronização desses certificados em empresas pequenas talvez não agregue muito valor à certificação.</w:t>
+            </w:r>
+          </w:p>
+        </w:tc>
+      </w:tr>
+      <w:tr>
+        <w:trPr>
+          <w:trHeight w:val="1101"/>
+          <w:tblHeader/>
+        </w:trPr>
+        <w:tc>
+          <w:tcPr>
+            <w:tcW w:w="0" w:type="auto"/>
+            <w:tcBorders>
+              <w:bottom w:val="single" w:sz="12" w:space="0" w:color="D9E4F2"/>
+            </w:tcBorders>
+            <w:shd w:val="clear" w:color="auto" w:fill="FFFFFF"/>
+            <w:tcMar>
+              <w:top w:w="135" w:type="dxa"/>
+              <w:left w:w="180" w:type="dxa"/>
+              <w:bottom w:w="135" w:type="dxa"/>
+              <w:right w:w="180" w:type="dxa"/>
+            </w:tcMar>
+            <w:vAlign w:val="center"/>
+          </w:tcPr>
+          <w:p>
+            <w:pPr>
+              <w:spacing w:after="240"/>
+            </w:pPr>
+            <w:r>
+              <w:t>Cadastro de alunos</w:t>
+            </w:r>
+          </w:p>
+        </w:tc>
+        <w:tc>
+          <w:tcPr>
+            <w:tcW w:w="0" w:type="auto"/>
+            <w:tcBorders>
+              <w:bottom w:val="single" w:sz="12" w:space="0" w:color="D9E4F2"/>
+            </w:tcBorders>
+            <w:shd w:val="clear" w:color="auto" w:fill="FFFFFF"/>
+            <w:tcMar>
+              <w:top w:w="135" w:type="dxa"/>
+              <w:left w:w="180" w:type="dxa"/>
+              <w:bottom w:w="135" w:type="dxa"/>
+              <w:right w:w="180" w:type="dxa"/>
+            </w:tcMar>
+            <w:vAlign w:val="center"/>
+          </w:tcPr>
+          <w:p>
+            <w:pPr>
+              <w:spacing w:after="240"/>
+            </w:pPr>
+            <w:r>
+              <w:t xml:space="preserve">Porque seria desnecessário para o objetivo de validar certificados. O único cadastro necessário é o de empresa, pois deve-se comprovar a credibilidade do curso para criar o </w:t>
+            </w:r>
+            <w:proofErr w:type="spellStart"/>
+            <w:r>
+              <w:t>hash</w:t>
+            </w:r>
+            <w:bookmarkStart w:id="0" w:name="_GoBack"/>
+            <w:bookmarkEnd w:id="0"/>
+            <w:proofErr w:type="spellEnd"/>
+            <w:r>
+              <w:t>, além de facilitar o agrupamento de certificados por empresa.</w:t>
+            </w:r>
+          </w:p>
+        </w:tc>
+      </w:tr>
+    </w:tbl>
     <w:p>
       <w:pPr>
         <w:spacing w:after="240"/>
       </w:pPr>
-      <w:r>
-        <w:t>(O que vocês decidiram não fazer, e por quê)</w:t>
-      </w:r>
     </w:p>
     <w:p>
       <w:pPr>
@@ -641,6 +1882,7 @@
           <w:sz w:val="32"/>
           <w:szCs w:val="32"/>
         </w:rPr>
+        <w:lastRenderedPageBreak/>
         <w:t>5. Viabilidade</w:t>
       </w:r>
     </w:p>
@@ -696,7 +1938,7 @@
 </file>
 
 <file path=word/numbering.xml><?xml version="1.0" encoding="utf-8"?>
-<w:numbering xmlns:wpc="http://schemas.microsoft.com/office/word/2010/wordprocessingCanvas" xmlns:cx="http://schemas.microsoft.com/office/drawing/2014/chartex" xmlns:cx1="http://schemas.microsoft.com/office/drawing/2015/9/8/chartex" xmlns:cx2="http://schemas.microsoft.com/office/drawing/2015/10/21/chartex" xmlns:cx3="http://schemas.microsoft.com/office/drawing/2016/5/9/chartex" xmlns:cx4="http://schemas.microsoft.com/office/drawing/2016/5/10/chartex" xmlns:cx5="http://schemas.microsoft.com/office/drawing/2016/5/11/chartex" xmlns:cx6="http://schemas.microsoft.com/office/drawing/2016/5/12/chartex" xmlns:cx7="http://schemas.microsoft.com/office/drawing/2016/5/13/chartex" xmlns:cx8="http://schemas.microsoft.com/office/drawing/2016/5/14/chartex" xmlns:mc="http://schemas.openxmlformats.org/markup-compatibility/2006" xmlns:aink="http://schemas.microsoft.com/office/drawing/2016/ink" xmlns:am3d="http://schemas.microsoft.com/office/drawing/2017/model3d" xmlns:o="urn:schemas-microsoft-com:office:office" xmlns:oel="http://schemas.microsoft.com/office/2019/extlst" xmlns:r="http://schemas.openxmlformats.org/officeDocument/2006/relationships" xmlns:m="http://schemas.openxmlformats.org/officeDocument/2006/math" xmlns:v="urn:schemas-microsoft-com:vml" xmlns:wp14="http://schemas.microsoft.com/office/word/2010/wordprocessingDrawing" xmlns:wp="http://schemas.openxmlformats.org/drawingml/2006/wordprocessingDrawing" xmlns:w10="urn:schemas-microsoft-com:office:word" xmlns:w="http://schemas.openxmlformats.org/wordprocessingml/2006/main" xmlns:w14="http://schemas.microsoft.com/office/word/2010/wordml" xmlns:w15="http://schemas.microsoft.com/office/word/2012/wordml" xmlns:w16cex="http://schemas.microsoft.com/office/word/2018/wordml/cex" xmlns:w16cid="http://schemas.microsoft.com/office/word/2016/wordml/cid" xmlns:w16="http://schemas.microsoft.com/office/word/2018/wordml" xmlns:w16du="http://schemas.microsoft.com/office/word/2023/wordml/word16du" xmlns:w16sdtdh="http://schemas.microsoft.com/office/word/2020/wordml/sdtdatahash" xmlns:w16sdtfl="http://schemas.microsoft.com/office/word/2024/wordml/sdtformatlock" xmlns:w16se="http://schemas.microsoft.com/office/word/2015/wordml/symex" xmlns:wpg="http://schemas.microsoft.com/office/word/2010/wordprocessingGroup" xmlns:wpi="http://schemas.microsoft.com/office/word/2010/wordprocessingInk" xmlns:wne="http://schemas.microsoft.com/office/word/2006/wordml" xmlns:wps="http://schemas.microsoft.com/office/word/2010/wordprocessingShape" mc:Ignorable="w14 w15 w16se w16cid w16 w16cex w16sdtdh w16sdtfl w16du wp14">
+<w:numbering xmlns:wpc="http://schemas.microsoft.com/office/word/2010/wordprocessingCanvas" xmlns:cx="http://schemas.microsoft.com/office/drawing/2014/chartex" xmlns:cx1="http://schemas.microsoft.com/office/drawing/2015/9/8/chartex" xmlns:cx2="http://schemas.microsoft.com/office/drawing/2015/10/21/chartex" xmlns:cx3="http://schemas.microsoft.com/office/drawing/2016/5/9/chartex" xmlns:cx4="http://schemas.microsoft.com/office/drawing/2016/5/10/chartex" xmlns:cx5="http://schemas.microsoft.com/office/drawing/2016/5/11/chartex" xmlns:cx6="http://schemas.microsoft.com/office/drawing/2016/5/12/chartex" xmlns:cx7="http://schemas.microsoft.com/office/drawing/2016/5/13/chartex" xmlns:cx8="http://schemas.microsoft.com/office/drawing/2016/5/14/chartex" xmlns:mc="http://schemas.openxmlformats.org/markup-compatibility/2006" xmlns:aink="http://schemas.microsoft.com/office/drawing/2016/ink" xmlns:am3d="http://schemas.microsoft.com/office/drawing/2017/model3d" xmlns:o="urn:schemas-microsoft-com:office:office" xmlns:r="http://schemas.openxmlformats.org/officeDocument/2006/relationships" xmlns:m="http://schemas.openxmlformats.org/officeDocument/2006/math" xmlns:v="urn:schemas-microsoft-com:vml" xmlns:wp14="http://schemas.microsoft.com/office/word/2010/wordprocessingDrawing" xmlns:wp="http://schemas.openxmlformats.org/drawingml/2006/wordprocessingDrawing" xmlns:w10="urn:schemas-microsoft-com:office:word" xmlns:w="http://schemas.openxmlformats.org/wordprocessingml/2006/main" xmlns:w14="http://schemas.microsoft.com/office/word/2010/wordml" xmlns:w15="http://schemas.microsoft.com/office/word/2012/wordml" xmlns:w16cid="http://schemas.microsoft.com/office/word/2016/wordml/cid" xmlns:w16se="http://schemas.microsoft.com/office/word/2015/wordml/symex" xmlns:wpg="http://schemas.microsoft.com/office/word/2010/wordprocessingGroup" xmlns:wpi="http://schemas.microsoft.com/office/word/2010/wordprocessingInk" xmlns:wne="http://schemas.microsoft.com/office/word/2006/wordml" xmlns:wps="http://schemas.microsoft.com/office/word/2010/wordprocessingShape" mc:Ignorable="w14 w15 w16se w16cid wp14">
   <w:abstractNum w:abstractNumId="0" w15:restartNumberingAfterBreak="0">
     <w:nsid w:val="FFFFFF7C"/>
     <w:multiLevelType w:val="singleLevel"/>
@@ -868,38 +2110,38 @@
       </w:rPr>
     </w:lvl>
   </w:abstractNum>
-  <w:num w:numId="1" w16cid:durableId="842017074">
+  <w:num w:numId="1">
     <w:abstractNumId w:val="8"/>
   </w:num>
-  <w:num w:numId="2" w16cid:durableId="1148549484">
+  <w:num w:numId="2">
     <w:abstractNumId w:val="6"/>
   </w:num>
-  <w:num w:numId="3" w16cid:durableId="2034719625">
+  <w:num w:numId="3">
     <w:abstractNumId w:val="5"/>
   </w:num>
-  <w:num w:numId="4" w16cid:durableId="1870407100">
+  <w:num w:numId="4">
     <w:abstractNumId w:val="4"/>
   </w:num>
-  <w:num w:numId="5" w16cid:durableId="146096081">
+  <w:num w:numId="5">
     <w:abstractNumId w:val="7"/>
   </w:num>
-  <w:num w:numId="6" w16cid:durableId="162816119">
+  <w:num w:numId="6">
     <w:abstractNumId w:val="3"/>
   </w:num>
-  <w:num w:numId="7" w16cid:durableId="1622300073">
+  <w:num w:numId="7">
     <w:abstractNumId w:val="2"/>
   </w:num>
-  <w:num w:numId="8" w16cid:durableId="91248559">
+  <w:num w:numId="8">
     <w:abstractNumId w:val="1"/>
   </w:num>
-  <w:num w:numId="9" w16cid:durableId="344669378">
+  <w:num w:numId="9">
     <w:abstractNumId w:val="0"/>
   </w:num>
 </w:numbering>
 </file>
 
 <file path=word/styles.xml><?xml version="1.0" encoding="utf-8"?>
-<w:styles xmlns:mc="http://schemas.openxmlformats.org/markup-compatibility/2006" xmlns:r="http://schemas.openxmlformats.org/officeDocument/2006/relationships" xmlns:w="http://schemas.openxmlformats.org/wordprocessingml/2006/main" xmlns:w14="http://schemas.microsoft.com/office/word/2010/wordml" xmlns:w15="http://schemas.microsoft.com/office/word/2012/wordml" xmlns:w16cex="http://schemas.microsoft.com/office/word/2018/wordml/cex" xmlns:w16cid="http://schemas.microsoft.com/office/word/2016/wordml/cid" xmlns:w16="http://schemas.microsoft.com/office/word/2018/wordml" xmlns:w16du="http://schemas.microsoft.com/office/word/2023/wordml/word16du" xmlns:w16sdtdh="http://schemas.microsoft.com/office/word/2020/wordml/sdtdatahash" xmlns:w16sdtfl="http://schemas.microsoft.com/office/word/2024/wordml/sdtformatlock" xmlns:w16se="http://schemas.microsoft.com/office/word/2015/wordml/symex" mc:Ignorable="w14 w15 w16se w16cid w16 w16cex w16sdtdh w16sdtfl w16du">
+<w:styles xmlns:mc="http://schemas.openxmlformats.org/markup-compatibility/2006" xmlns:r="http://schemas.openxmlformats.org/officeDocument/2006/relationships" xmlns:w="http://schemas.openxmlformats.org/wordprocessingml/2006/main" xmlns:w14="http://schemas.microsoft.com/office/word/2010/wordml" xmlns:w15="http://schemas.microsoft.com/office/word/2012/wordml" xmlns:w16cid="http://schemas.microsoft.com/office/word/2016/wordml/cid" xmlns:w16se="http://schemas.microsoft.com/office/word/2015/wordml/symex" mc:Ignorable="w14 w15 w16se w16cid">
   <w:docDefaults>
     <w:rPrDefault>
       <w:rPr>
@@ -915,7 +2157,7 @@
       </w:pPr>
     </w:pPrDefault>
   </w:docDefaults>
-  <w:latentStyles w:defLockedState="0" w:defUIPriority="99" w:defSemiHidden="0" w:defUnhideWhenUsed="0" w:defQFormat="0" w:count="376">
+  <w:latentStyles w:defLockedState="0" w:defUIPriority="99" w:defSemiHidden="0" w:defUnhideWhenUsed="0" w:defQFormat="0" w:count="375">
     <w:lsdException w:name="Normal" w:uiPriority="0" w:qFormat="1"/>
     <w:lsdException w:name="heading 1" w:uiPriority="9" w:qFormat="1"/>
     <w:lsdException w:name="heading 2" w:semiHidden="1" w:uiPriority="9" w:unhideWhenUsed="1" w:qFormat="1"/>
@@ -1282,7 +2524,6 @@
     <w:lsdException w:name="Smart Hyperlink" w:semiHidden="1" w:unhideWhenUsed="1"/>
     <w:lsdException w:name="Hashtag" w:semiHidden="1" w:unhideWhenUsed="1"/>
     <w:lsdException w:name="Unresolved Mention" w:semiHidden="1" w:unhideWhenUsed="1"/>
-    <w:lsdException w:name="Smart Link" w:semiHidden="1" w:unhideWhenUsed="1"/>
   </w:latentStyles>
   <w:style w:type="paragraph" w:default="1" w:styleId="Normal">
     <w:name w:val="Normal"/>
@@ -12602,7 +13843,7 @@
 </file>
 
 <file path=customXml/itemProps1.xml><?xml version="1.0" encoding="utf-8"?>
-<ds:datastoreItem xmlns:ds="http://schemas.openxmlformats.org/officeDocument/2006/customXml" ds:itemID="{EF278816-EC6F-A645-907D-7F25AECB1D4A}">
+<ds:datastoreItem xmlns:ds="http://schemas.openxmlformats.org/officeDocument/2006/customXml" ds:itemID="{328EB984-D75D-4FA3-A900-51A767A3F793}">
   <ds:schemaRefs>
     <ds:schemaRef ds:uri="http://schemas.openxmlformats.org/officeDocument/2006/bibliography"/>
   </ds:schemaRefs>

</xml_diff>

<commit_message>
docs: escopo do projeto v0.4 OP#166
</commit_message>
<xml_diff>
--- a/docs/ESCOPO-0102-grupo05 v2.docx
+++ b/docs/ESCOPO-0102-grupo05 v2.docx
@@ -587,11 +587,11 @@
         <w:tblLook w:val="04A0" w:firstRow="1" w:lastRow="0" w:firstColumn="1" w:lastColumn="0" w:noHBand="0" w:noVBand="1"/>
       </w:tblPr>
       <w:tblGrid>
-        <w:gridCol w:w="602"/>
+        <w:gridCol w:w="609"/>
         <w:gridCol w:w="3162"/>
         <w:gridCol w:w="4774"/>
-        <w:gridCol w:w="773"/>
-        <w:gridCol w:w="850"/>
+        <w:gridCol w:w="769"/>
+        <w:gridCol w:w="847"/>
       </w:tblGrid>
       <w:tr>
         <w:trPr>
@@ -619,7 +619,6 @@
               <w:spacing w:after="0" w:line="240" w:lineRule="auto"/>
               <w:rPr>
                 <w:rFonts w:asciiTheme="majorHAnsi" w:eastAsia="Times New Roman" w:hAnsiTheme="majorHAnsi" w:cstheme="majorHAnsi"/>
-                <w:b/>
                 <w:bCs/>
                 <w:color w:val="003383"/>
                 <w:lang w:eastAsia="pt-BR"/>
@@ -628,7 +627,6 @@
             <w:r>
               <w:rPr>
                 <w:rFonts w:asciiTheme="majorHAnsi" w:eastAsia="Times New Roman" w:hAnsiTheme="majorHAnsi" w:cstheme="majorHAnsi"/>
-                <w:b/>
                 <w:bCs/>
                 <w:color w:val="003383"/>
                 <w:lang w:eastAsia="pt-BR"/>
@@ -658,7 +656,6 @@
               <w:spacing w:after="0" w:line="240" w:lineRule="auto"/>
               <w:rPr>
                 <w:rFonts w:asciiTheme="majorHAnsi" w:eastAsia="Times New Roman" w:hAnsiTheme="majorHAnsi" w:cstheme="majorHAnsi"/>
-                <w:b/>
                 <w:bCs/>
                 <w:color w:val="003383"/>
                 <w:lang w:eastAsia="pt-BR"/>
@@ -667,7 +664,6 @@
             <w:r>
               <w:rPr>
                 <w:rFonts w:asciiTheme="majorHAnsi" w:eastAsia="Times New Roman" w:hAnsiTheme="majorHAnsi" w:cstheme="majorHAnsi"/>
-                <w:b/>
                 <w:bCs/>
                 <w:color w:val="003383"/>
                 <w:lang w:eastAsia="pt-BR"/>
@@ -697,7 +693,6 @@
               <w:spacing w:after="0" w:line="240" w:lineRule="auto"/>
               <w:rPr>
                 <w:rFonts w:asciiTheme="majorHAnsi" w:eastAsia="Times New Roman" w:hAnsiTheme="majorHAnsi" w:cstheme="majorHAnsi"/>
-                <w:b/>
                 <w:bCs/>
                 <w:color w:val="003383"/>
                 <w:lang w:eastAsia="pt-BR"/>
@@ -706,7 +701,6 @@
             <w:r>
               <w:rPr>
                 <w:rFonts w:asciiTheme="majorHAnsi" w:eastAsia="Times New Roman" w:hAnsiTheme="majorHAnsi" w:cstheme="majorHAnsi"/>
-                <w:b/>
                 <w:bCs/>
                 <w:color w:val="003383"/>
                 <w:lang w:eastAsia="pt-BR"/>
@@ -736,7 +730,6 @@
               <w:spacing w:after="0" w:line="240" w:lineRule="auto"/>
               <w:rPr>
                 <w:rFonts w:asciiTheme="majorHAnsi" w:eastAsia="Times New Roman" w:hAnsiTheme="majorHAnsi" w:cstheme="majorHAnsi"/>
-                <w:b/>
                 <w:bCs/>
                 <w:color w:val="003383"/>
                 <w:lang w:eastAsia="pt-BR"/>
@@ -746,7 +739,6 @@
             <w:r>
               <w:rPr>
                 <w:rFonts w:asciiTheme="majorHAnsi" w:eastAsia="Times New Roman" w:hAnsiTheme="majorHAnsi" w:cstheme="majorHAnsi"/>
-                <w:b/>
                 <w:bCs/>
                 <w:color w:val="003383"/>
                 <w:lang w:eastAsia="pt-BR"/>
@@ -757,7 +749,6 @@
             <w:r>
               <w:rPr>
                 <w:rFonts w:asciiTheme="majorHAnsi" w:eastAsia="Times New Roman" w:hAnsiTheme="majorHAnsi" w:cstheme="majorHAnsi"/>
-                <w:b/>
                 <w:bCs/>
                 <w:color w:val="003383"/>
                 <w:lang w:eastAsia="pt-BR"/>
@@ -787,7 +778,6 @@
               <w:spacing w:after="0" w:line="240" w:lineRule="auto"/>
               <w:rPr>
                 <w:rFonts w:asciiTheme="majorHAnsi" w:eastAsia="Times New Roman" w:hAnsiTheme="majorHAnsi" w:cstheme="majorHAnsi"/>
-                <w:b/>
                 <w:bCs/>
                 <w:color w:val="003383"/>
                 <w:lang w:eastAsia="pt-BR"/>
@@ -796,12 +786,834 @@
             <w:r>
               <w:rPr>
                 <w:rFonts w:asciiTheme="majorHAnsi" w:eastAsia="Times New Roman" w:hAnsiTheme="majorHAnsi" w:cstheme="majorHAnsi"/>
-                <w:b/>
                 <w:bCs/>
                 <w:color w:val="003383"/>
                 <w:lang w:eastAsia="pt-BR"/>
               </w:rPr>
               <w:t>Tam.</w:t>
+            </w:r>
+          </w:p>
+        </w:tc>
+      </w:tr>
+      <w:tr>
+        <w:trPr>
+          <w:trHeight w:val="144"/>
+          <w:tblHeader/>
+        </w:trPr>
+        <w:tc>
+          <w:tcPr>
+            <w:tcW w:w="0" w:type="auto"/>
+            <w:tcBorders>
+              <w:bottom w:val="single" w:sz="12" w:space="0" w:color="D9E4F2"/>
+            </w:tcBorders>
+            <w:shd w:val="clear" w:color="auto" w:fill="FFFFFF"/>
+            <w:tcMar>
+              <w:top w:w="135" w:type="dxa"/>
+              <w:left w:w="180" w:type="dxa"/>
+              <w:bottom w:w="135" w:type="dxa"/>
+              <w:right w:w="180" w:type="dxa"/>
+            </w:tcMar>
+            <w:vAlign w:val="center"/>
+          </w:tcPr>
+          <w:p>
+            <w:pPr>
+              <w:spacing w:after="0" w:line="240" w:lineRule="auto"/>
+              <w:rPr>
+                <w:rFonts w:asciiTheme="majorHAnsi" w:eastAsia="Times New Roman" w:hAnsiTheme="majorHAnsi" w:cstheme="majorHAnsi"/>
+                <w:bCs/>
+                <w:color w:val="003383"/>
+                <w:lang w:eastAsia="pt-BR"/>
+              </w:rPr>
+            </w:pPr>
+            <w:r>
+              <w:rPr>
+                <w:rFonts w:asciiTheme="majorHAnsi" w:eastAsia="Times New Roman" w:hAnsiTheme="majorHAnsi" w:cstheme="majorHAnsi"/>
+                <w:bCs/>
+                <w:color w:val="auto"/>
+                <w:lang w:eastAsia="pt-BR"/>
+              </w:rPr>
+              <w:t>E1</w:t>
+            </w:r>
+          </w:p>
+        </w:tc>
+        <w:tc>
+          <w:tcPr>
+            <w:tcW w:w="3162" w:type="dxa"/>
+            <w:tcBorders>
+              <w:bottom w:val="single" w:sz="12" w:space="0" w:color="D9E4F2"/>
+            </w:tcBorders>
+            <w:shd w:val="clear" w:color="auto" w:fill="FFFFFF"/>
+            <w:tcMar>
+              <w:top w:w="135" w:type="dxa"/>
+              <w:left w:w="180" w:type="dxa"/>
+              <w:bottom w:w="135" w:type="dxa"/>
+              <w:right w:w="180" w:type="dxa"/>
+            </w:tcMar>
+            <w:vAlign w:val="center"/>
+          </w:tcPr>
+          <w:p>
+            <w:pPr>
+              <w:spacing w:after="0" w:line="240" w:lineRule="auto"/>
+              <w:rPr>
+                <w:rFonts w:asciiTheme="majorHAnsi" w:eastAsia="Times New Roman" w:hAnsiTheme="majorHAnsi" w:cstheme="majorHAnsi"/>
+                <w:bCs/>
+                <w:color w:val="003383"/>
+                <w:lang w:eastAsia="pt-BR"/>
+              </w:rPr>
+            </w:pPr>
+            <w:r>
+              <w:rPr>
+                <w:rFonts w:asciiTheme="majorHAnsi" w:eastAsia="Calibri" w:hAnsiTheme="majorHAnsi" w:cstheme="majorHAnsi"/>
+                <w:color w:val="auto"/>
+              </w:rPr>
+              <w:t>Autenticar e restringir o acesso de registro de certificados</w:t>
+            </w:r>
+          </w:p>
+        </w:tc>
+        <w:tc>
+          <w:tcPr>
+            <w:tcW w:w="4774" w:type="dxa"/>
+            <w:tcBorders>
+              <w:bottom w:val="single" w:sz="12" w:space="0" w:color="D9E4F2"/>
+            </w:tcBorders>
+            <w:shd w:val="clear" w:color="auto" w:fill="FFFFFF"/>
+            <w:tcMar>
+              <w:top w:w="135" w:type="dxa"/>
+              <w:left w:w="180" w:type="dxa"/>
+              <w:bottom w:w="135" w:type="dxa"/>
+              <w:right w:w="180" w:type="dxa"/>
+            </w:tcMar>
+            <w:vAlign w:val="center"/>
+          </w:tcPr>
+          <w:p>
+            <w:pPr>
+              <w:spacing w:after="0" w:line="240" w:lineRule="auto"/>
+              <w:rPr>
+                <w:rFonts w:asciiTheme="majorHAnsi" w:eastAsia="Times New Roman" w:hAnsiTheme="majorHAnsi" w:cstheme="majorHAnsi"/>
+                <w:bCs/>
+                <w:color w:val="003383"/>
+                <w:lang w:eastAsia="pt-BR"/>
+              </w:rPr>
+            </w:pPr>
+            <w:r>
+              <w:rPr>
+                <w:bCs/>
+              </w:rPr>
+              <w:t>Um usuário não autorizado (</w:t>
+            </w:r>
+            <w:proofErr w:type="spellStart"/>
+            <w:r>
+              <w:rPr>
+                <w:bCs/>
+              </w:rPr>
+              <w:t>ex</w:t>
+            </w:r>
+            <w:proofErr w:type="spellEnd"/>
+            <w:r>
+              <w:rPr>
+                <w:bCs/>
+              </w:rPr>
+              <w:t>: aluno)</w:t>
+            </w:r>
+            <w:r>
+              <w:t xml:space="preserve"> faz </w:t>
+            </w:r>
+            <w:r>
+              <w:rPr>
+                <w:bCs/>
+              </w:rPr>
+              <w:t>a tentativa de acessar a área de emissão</w:t>
+            </w:r>
+            <w:r>
+              <w:t xml:space="preserve"> e </w:t>
+            </w:r>
+            <w:r>
+              <w:rPr>
+                <w:bCs/>
+              </w:rPr>
+              <w:t>o sistema bloqueia o acesso, permitindo apenas emissores.</w:t>
+            </w:r>
+          </w:p>
+        </w:tc>
+        <w:tc>
+          <w:tcPr>
+            <w:tcW w:w="0" w:type="auto"/>
+            <w:tcBorders>
+              <w:bottom w:val="single" w:sz="12" w:space="0" w:color="D9E4F2"/>
+            </w:tcBorders>
+            <w:shd w:val="clear" w:color="auto" w:fill="FFFFFF"/>
+            <w:tcMar>
+              <w:top w:w="135" w:type="dxa"/>
+              <w:left w:w="180" w:type="dxa"/>
+              <w:bottom w:w="135" w:type="dxa"/>
+              <w:right w:w="180" w:type="dxa"/>
+            </w:tcMar>
+            <w:vAlign w:val="center"/>
+          </w:tcPr>
+          <w:p>
+            <w:pPr>
+              <w:spacing w:after="0" w:line="240" w:lineRule="auto"/>
+              <w:rPr>
+                <w:rFonts w:asciiTheme="majorHAnsi" w:eastAsia="Times New Roman" w:hAnsiTheme="majorHAnsi" w:cstheme="majorHAnsi"/>
+                <w:bCs/>
+                <w:color w:val="003383"/>
+                <w:lang w:eastAsia="pt-BR"/>
+              </w:rPr>
+            </w:pPr>
+            <w:r>
+              <w:rPr>
+                <w:rFonts w:asciiTheme="majorHAnsi" w:eastAsia="Times New Roman" w:hAnsiTheme="majorHAnsi" w:cstheme="majorHAnsi"/>
+                <w:bCs/>
+                <w:color w:val="auto"/>
+                <w:lang w:eastAsia="pt-BR"/>
+              </w:rPr>
+              <w:t>OE1</w:t>
+            </w:r>
+          </w:p>
+        </w:tc>
+        <w:tc>
+          <w:tcPr>
+            <w:tcW w:w="0" w:type="auto"/>
+            <w:tcBorders>
+              <w:bottom w:val="single" w:sz="12" w:space="0" w:color="D9E4F2"/>
+            </w:tcBorders>
+            <w:shd w:val="clear" w:color="auto" w:fill="FFFFFF"/>
+            <w:tcMar>
+              <w:top w:w="135" w:type="dxa"/>
+              <w:left w:w="180" w:type="dxa"/>
+              <w:bottom w:w="135" w:type="dxa"/>
+              <w:right w:w="180" w:type="dxa"/>
+            </w:tcMar>
+            <w:vAlign w:val="center"/>
+          </w:tcPr>
+          <w:p>
+            <w:pPr>
+              <w:spacing w:after="0" w:line="240" w:lineRule="auto"/>
+              <w:rPr>
+                <w:rFonts w:asciiTheme="majorHAnsi" w:eastAsia="Times New Roman" w:hAnsiTheme="majorHAnsi" w:cstheme="majorHAnsi"/>
+                <w:bCs/>
+                <w:color w:val="003383"/>
+                <w:lang w:eastAsia="pt-BR"/>
+              </w:rPr>
+            </w:pPr>
+            <w:r>
+              <w:rPr>
+                <w:rFonts w:asciiTheme="majorHAnsi" w:eastAsia="Times New Roman" w:hAnsiTheme="majorHAnsi" w:cstheme="majorHAnsi"/>
+                <w:bCs/>
+                <w:color w:val="auto"/>
+                <w:lang w:eastAsia="pt-BR"/>
+              </w:rPr>
+              <w:t>M</w:t>
+            </w:r>
+          </w:p>
+        </w:tc>
+      </w:tr>
+      <w:tr>
+        <w:trPr>
+          <w:trHeight w:val="144"/>
+          <w:tblHeader/>
+        </w:trPr>
+        <w:tc>
+          <w:tcPr>
+            <w:tcW w:w="0" w:type="auto"/>
+            <w:tcBorders>
+              <w:bottom w:val="single" w:sz="12" w:space="0" w:color="D9E4F2"/>
+            </w:tcBorders>
+            <w:shd w:val="clear" w:color="auto" w:fill="FFFFFF"/>
+            <w:tcMar>
+              <w:top w:w="135" w:type="dxa"/>
+              <w:left w:w="180" w:type="dxa"/>
+              <w:bottom w:w="135" w:type="dxa"/>
+              <w:right w:w="180" w:type="dxa"/>
+            </w:tcMar>
+            <w:vAlign w:val="center"/>
+          </w:tcPr>
+          <w:p>
+            <w:pPr>
+              <w:spacing w:after="0" w:line="240" w:lineRule="auto"/>
+              <w:rPr>
+                <w:rFonts w:asciiTheme="majorHAnsi" w:eastAsia="Times New Roman" w:hAnsiTheme="majorHAnsi" w:cstheme="majorHAnsi"/>
+                <w:bCs/>
+                <w:color w:val="003383"/>
+                <w:lang w:eastAsia="pt-BR"/>
+              </w:rPr>
+            </w:pPr>
+            <w:r>
+              <w:rPr>
+                <w:rFonts w:asciiTheme="majorHAnsi" w:eastAsia="Times New Roman" w:hAnsiTheme="majorHAnsi" w:cstheme="majorHAnsi"/>
+                <w:bCs/>
+                <w:color w:val="auto"/>
+                <w:lang w:eastAsia="pt-BR"/>
+              </w:rPr>
+              <w:t>E2</w:t>
+            </w:r>
+          </w:p>
+        </w:tc>
+        <w:tc>
+          <w:tcPr>
+            <w:tcW w:w="3162" w:type="dxa"/>
+            <w:tcBorders>
+              <w:bottom w:val="single" w:sz="12" w:space="0" w:color="D9E4F2"/>
+            </w:tcBorders>
+            <w:shd w:val="clear" w:color="auto" w:fill="FFFFFF"/>
+            <w:tcMar>
+              <w:top w:w="135" w:type="dxa"/>
+              <w:left w:w="180" w:type="dxa"/>
+              <w:bottom w:w="135" w:type="dxa"/>
+              <w:right w:w="180" w:type="dxa"/>
+            </w:tcMar>
+            <w:vAlign w:val="center"/>
+          </w:tcPr>
+          <w:p>
+            <w:pPr>
+              <w:spacing w:after="0" w:line="240" w:lineRule="auto"/>
+              <w:rPr>
+                <w:rFonts w:asciiTheme="majorHAnsi" w:eastAsia="Times New Roman" w:hAnsiTheme="majorHAnsi" w:cstheme="majorHAnsi"/>
+                <w:bCs/>
+                <w:color w:val="003383"/>
+                <w:lang w:eastAsia="pt-BR"/>
+              </w:rPr>
+            </w:pPr>
+            <w:r>
+              <w:rPr>
+                <w:rFonts w:asciiTheme="majorHAnsi" w:eastAsia="Calibri" w:hAnsiTheme="majorHAnsi" w:cstheme="majorHAnsi"/>
+                <w:color w:val="auto"/>
+              </w:rPr>
+              <w:t>Registrar os certificados</w:t>
+            </w:r>
+          </w:p>
+        </w:tc>
+        <w:tc>
+          <w:tcPr>
+            <w:tcW w:w="4774" w:type="dxa"/>
+            <w:tcBorders>
+              <w:bottom w:val="single" w:sz="12" w:space="0" w:color="D9E4F2"/>
+            </w:tcBorders>
+            <w:shd w:val="clear" w:color="auto" w:fill="FFFFFF"/>
+            <w:tcMar>
+              <w:top w:w="135" w:type="dxa"/>
+              <w:left w:w="180" w:type="dxa"/>
+              <w:bottom w:w="135" w:type="dxa"/>
+              <w:right w:w="180" w:type="dxa"/>
+            </w:tcMar>
+            <w:vAlign w:val="center"/>
+          </w:tcPr>
+          <w:p>
+            <w:pPr>
+              <w:spacing w:after="0" w:line="240" w:lineRule="auto"/>
+              <w:rPr>
+                <w:rFonts w:asciiTheme="majorHAnsi" w:eastAsia="Times New Roman" w:hAnsiTheme="majorHAnsi" w:cstheme="majorHAnsi"/>
+                <w:bCs/>
+                <w:color w:val="003383"/>
+                <w:lang w:eastAsia="pt-BR"/>
+              </w:rPr>
+            </w:pPr>
+            <w:r>
+              <w:rPr>
+                <w:bCs/>
+              </w:rPr>
+              <w:t>O emissor formalizado</w:t>
+            </w:r>
+            <w:r>
+              <w:t xml:space="preserve"> faz </w:t>
+            </w:r>
+            <w:r>
+              <w:rPr>
+                <w:bCs/>
+              </w:rPr>
+              <w:t>o preenchimento dos dados obrigatórios de um aluno</w:t>
+            </w:r>
+            <w:r>
+              <w:t xml:space="preserve"> e </w:t>
+            </w:r>
+            <w:r>
+              <w:rPr>
+                <w:bCs/>
+              </w:rPr>
+              <w:t xml:space="preserve">o certificado é registrado na </w:t>
+            </w:r>
+            <w:proofErr w:type="spellStart"/>
+            <w:r>
+              <w:rPr>
+                <w:bCs/>
+              </w:rPr>
+              <w:t>blockchain</w:t>
+            </w:r>
+            <w:proofErr w:type="spellEnd"/>
+            <w:r>
+              <w:rPr>
+                <w:bCs/>
+              </w:rPr>
+              <w:t xml:space="preserve"> com uma chave única.</w:t>
+            </w:r>
+          </w:p>
+        </w:tc>
+        <w:tc>
+          <w:tcPr>
+            <w:tcW w:w="0" w:type="auto"/>
+            <w:tcBorders>
+              <w:bottom w:val="single" w:sz="12" w:space="0" w:color="D9E4F2"/>
+            </w:tcBorders>
+            <w:shd w:val="clear" w:color="auto" w:fill="FFFFFF"/>
+            <w:tcMar>
+              <w:top w:w="135" w:type="dxa"/>
+              <w:left w:w="180" w:type="dxa"/>
+              <w:bottom w:w="135" w:type="dxa"/>
+              <w:right w:w="180" w:type="dxa"/>
+            </w:tcMar>
+            <w:vAlign w:val="center"/>
+          </w:tcPr>
+          <w:p>
+            <w:pPr>
+              <w:spacing w:after="0" w:line="240" w:lineRule="auto"/>
+              <w:rPr>
+                <w:rFonts w:asciiTheme="majorHAnsi" w:eastAsia="Times New Roman" w:hAnsiTheme="majorHAnsi" w:cstheme="majorHAnsi"/>
+                <w:bCs/>
+                <w:color w:val="003383"/>
+                <w:lang w:eastAsia="pt-BR"/>
+              </w:rPr>
+            </w:pPr>
+            <w:r>
+              <w:rPr>
+                <w:rFonts w:asciiTheme="majorHAnsi" w:eastAsia="Times New Roman" w:hAnsiTheme="majorHAnsi" w:cstheme="majorHAnsi"/>
+                <w:bCs/>
+                <w:color w:val="auto"/>
+                <w:lang w:eastAsia="pt-BR"/>
+              </w:rPr>
+              <w:t>OE2</w:t>
+            </w:r>
+          </w:p>
+        </w:tc>
+        <w:tc>
+          <w:tcPr>
+            <w:tcW w:w="0" w:type="auto"/>
+            <w:tcBorders>
+              <w:bottom w:val="single" w:sz="12" w:space="0" w:color="D9E4F2"/>
+            </w:tcBorders>
+            <w:shd w:val="clear" w:color="auto" w:fill="FFFFFF"/>
+            <w:tcMar>
+              <w:top w:w="135" w:type="dxa"/>
+              <w:left w:w="180" w:type="dxa"/>
+              <w:bottom w:w="135" w:type="dxa"/>
+              <w:right w:w="180" w:type="dxa"/>
+            </w:tcMar>
+            <w:vAlign w:val="center"/>
+          </w:tcPr>
+          <w:p>
+            <w:pPr>
+              <w:spacing w:after="0" w:line="240" w:lineRule="auto"/>
+              <w:rPr>
+                <w:rFonts w:asciiTheme="majorHAnsi" w:eastAsia="Times New Roman" w:hAnsiTheme="majorHAnsi" w:cstheme="majorHAnsi"/>
+                <w:bCs/>
+                <w:color w:val="003383"/>
+                <w:lang w:eastAsia="pt-BR"/>
+              </w:rPr>
+            </w:pPr>
+            <w:r>
+              <w:rPr>
+                <w:rFonts w:asciiTheme="majorHAnsi" w:eastAsia="Times New Roman" w:hAnsiTheme="majorHAnsi" w:cstheme="majorHAnsi"/>
+                <w:bCs/>
+                <w:color w:val="auto"/>
+                <w:lang w:eastAsia="pt-BR"/>
+              </w:rPr>
+              <w:t>G</w:t>
+            </w:r>
+          </w:p>
+        </w:tc>
+      </w:tr>
+      <w:tr>
+        <w:trPr>
+          <w:trHeight w:val="144"/>
+          <w:tblHeader/>
+        </w:trPr>
+        <w:tc>
+          <w:tcPr>
+            <w:tcW w:w="0" w:type="auto"/>
+            <w:tcBorders>
+              <w:bottom w:val="single" w:sz="12" w:space="0" w:color="D9E4F2"/>
+            </w:tcBorders>
+            <w:shd w:val="clear" w:color="auto" w:fill="FFFFFF"/>
+            <w:tcMar>
+              <w:top w:w="135" w:type="dxa"/>
+              <w:left w:w="180" w:type="dxa"/>
+              <w:bottom w:w="135" w:type="dxa"/>
+              <w:right w:w="180" w:type="dxa"/>
+            </w:tcMar>
+            <w:vAlign w:val="center"/>
+          </w:tcPr>
+          <w:p>
+            <w:pPr>
+              <w:spacing w:after="0" w:line="240" w:lineRule="auto"/>
+              <w:rPr>
+                <w:rFonts w:asciiTheme="majorHAnsi" w:eastAsia="Times New Roman" w:hAnsiTheme="majorHAnsi" w:cstheme="majorHAnsi"/>
+                <w:bCs/>
+                <w:color w:val="003383"/>
+                <w:lang w:eastAsia="pt-BR"/>
+              </w:rPr>
+            </w:pPr>
+            <w:r>
+              <w:rPr>
+                <w:rFonts w:asciiTheme="majorHAnsi" w:eastAsia="Times New Roman" w:hAnsiTheme="majorHAnsi" w:cstheme="majorHAnsi"/>
+                <w:bCs/>
+                <w:color w:val="auto"/>
+                <w:lang w:eastAsia="pt-BR"/>
+              </w:rPr>
+              <w:t>E3</w:t>
+            </w:r>
+          </w:p>
+        </w:tc>
+        <w:tc>
+          <w:tcPr>
+            <w:tcW w:w="3162" w:type="dxa"/>
+            <w:tcBorders>
+              <w:bottom w:val="single" w:sz="12" w:space="0" w:color="D9E4F2"/>
+            </w:tcBorders>
+            <w:shd w:val="clear" w:color="auto" w:fill="FFFFFF"/>
+            <w:tcMar>
+              <w:top w:w="135" w:type="dxa"/>
+              <w:left w:w="180" w:type="dxa"/>
+              <w:bottom w:w="135" w:type="dxa"/>
+              <w:right w:w="180" w:type="dxa"/>
+            </w:tcMar>
+            <w:vAlign w:val="center"/>
+          </w:tcPr>
+          <w:p>
+            <w:pPr>
+              <w:spacing w:after="0" w:line="240" w:lineRule="auto"/>
+              <w:rPr>
+                <w:rFonts w:asciiTheme="majorHAnsi" w:eastAsia="Times New Roman" w:hAnsiTheme="majorHAnsi" w:cstheme="majorHAnsi"/>
+                <w:bCs/>
+                <w:color w:val="003383"/>
+                <w:lang w:eastAsia="pt-BR"/>
+              </w:rPr>
+            </w:pPr>
+            <w:r>
+              <w:rPr>
+                <w:rFonts w:asciiTheme="majorHAnsi" w:eastAsia="Calibri" w:hAnsiTheme="majorHAnsi" w:cstheme="majorHAnsi"/>
+                <w:color w:val="auto"/>
+              </w:rPr>
+              <w:t>Disponibilizar uma interface de consulta pública</w:t>
+            </w:r>
+          </w:p>
+        </w:tc>
+        <w:tc>
+          <w:tcPr>
+            <w:tcW w:w="4774" w:type="dxa"/>
+            <w:tcBorders>
+              <w:bottom w:val="single" w:sz="12" w:space="0" w:color="D9E4F2"/>
+            </w:tcBorders>
+            <w:shd w:val="clear" w:color="auto" w:fill="FFFFFF"/>
+            <w:tcMar>
+              <w:top w:w="135" w:type="dxa"/>
+              <w:left w:w="180" w:type="dxa"/>
+              <w:bottom w:w="135" w:type="dxa"/>
+              <w:right w:w="180" w:type="dxa"/>
+            </w:tcMar>
+            <w:vAlign w:val="center"/>
+          </w:tcPr>
+          <w:p>
+            <w:pPr>
+              <w:spacing w:after="0" w:line="240" w:lineRule="auto"/>
+              <w:rPr>
+                <w:rFonts w:asciiTheme="majorHAnsi" w:eastAsia="Times New Roman" w:hAnsiTheme="majorHAnsi" w:cstheme="majorHAnsi"/>
+                <w:bCs/>
+                <w:color w:val="003383"/>
+                <w:lang w:eastAsia="pt-BR"/>
+              </w:rPr>
+            </w:pPr>
+            <w:r>
+              <w:rPr>
+                <w:bCs/>
+              </w:rPr>
+              <w:t>Qualquer pessoa</w:t>
+            </w:r>
+            <w:r>
+              <w:t xml:space="preserve"> faz </w:t>
+            </w:r>
+            <w:r>
+              <w:rPr>
+                <w:bCs/>
+              </w:rPr>
+              <w:t>a inserção da chave de autenticação na interface</w:t>
+            </w:r>
+            <w:r>
+              <w:t xml:space="preserve"> e </w:t>
+            </w:r>
+            <w:r>
+              <w:rPr>
+                <w:bCs/>
+              </w:rPr>
+              <w:t>o sistema exibe o status e a veracidade do certificado.</w:t>
+            </w:r>
+          </w:p>
+        </w:tc>
+        <w:tc>
+          <w:tcPr>
+            <w:tcW w:w="0" w:type="auto"/>
+            <w:tcBorders>
+              <w:bottom w:val="single" w:sz="12" w:space="0" w:color="D9E4F2"/>
+            </w:tcBorders>
+            <w:shd w:val="clear" w:color="auto" w:fill="FFFFFF"/>
+            <w:tcMar>
+              <w:top w:w="135" w:type="dxa"/>
+              <w:left w:w="180" w:type="dxa"/>
+              <w:bottom w:w="135" w:type="dxa"/>
+              <w:right w:w="180" w:type="dxa"/>
+            </w:tcMar>
+            <w:vAlign w:val="center"/>
+          </w:tcPr>
+          <w:p>
+            <w:pPr>
+              <w:spacing w:after="0" w:line="240" w:lineRule="auto"/>
+              <w:rPr>
+                <w:rFonts w:asciiTheme="majorHAnsi" w:eastAsia="Times New Roman" w:hAnsiTheme="majorHAnsi" w:cstheme="majorHAnsi"/>
+                <w:bCs/>
+                <w:color w:val="003383"/>
+                <w:lang w:eastAsia="pt-BR"/>
+              </w:rPr>
+            </w:pPr>
+            <w:r>
+              <w:rPr>
+                <w:rFonts w:asciiTheme="majorHAnsi" w:eastAsia="Times New Roman" w:hAnsiTheme="majorHAnsi" w:cstheme="majorHAnsi"/>
+                <w:bCs/>
+                <w:color w:val="auto"/>
+                <w:lang w:eastAsia="pt-BR"/>
+              </w:rPr>
+              <w:t>OE3</w:t>
+            </w:r>
+          </w:p>
+        </w:tc>
+        <w:tc>
+          <w:tcPr>
+            <w:tcW w:w="0" w:type="auto"/>
+            <w:tcBorders>
+              <w:bottom w:val="single" w:sz="12" w:space="0" w:color="D9E4F2"/>
+            </w:tcBorders>
+            <w:shd w:val="clear" w:color="auto" w:fill="FFFFFF"/>
+            <w:tcMar>
+              <w:top w:w="135" w:type="dxa"/>
+              <w:left w:w="180" w:type="dxa"/>
+              <w:bottom w:w="135" w:type="dxa"/>
+              <w:right w:w="180" w:type="dxa"/>
+            </w:tcMar>
+            <w:vAlign w:val="center"/>
+          </w:tcPr>
+          <w:p>
+            <w:pPr>
+              <w:spacing w:after="0" w:line="240" w:lineRule="auto"/>
+              <w:rPr>
+                <w:rFonts w:asciiTheme="majorHAnsi" w:eastAsia="Times New Roman" w:hAnsiTheme="majorHAnsi" w:cstheme="majorHAnsi"/>
+                <w:bCs/>
+                <w:color w:val="003383"/>
+                <w:lang w:eastAsia="pt-BR"/>
+              </w:rPr>
+            </w:pPr>
+            <w:r>
+              <w:rPr>
+                <w:rFonts w:asciiTheme="majorHAnsi" w:eastAsia="Times New Roman" w:hAnsiTheme="majorHAnsi" w:cstheme="majorHAnsi"/>
+                <w:bCs/>
+                <w:color w:val="auto"/>
+                <w:lang w:eastAsia="pt-BR"/>
+              </w:rPr>
+              <w:t>P</w:t>
+            </w:r>
+          </w:p>
+        </w:tc>
+      </w:tr>
+      <w:tr>
+        <w:trPr>
+          <w:trHeight w:val="144"/>
+          <w:tblHeader/>
+        </w:trPr>
+        <w:tc>
+          <w:tcPr>
+            <w:tcW w:w="0" w:type="auto"/>
+            <w:tcBorders>
+              <w:bottom w:val="single" w:sz="12" w:space="0" w:color="D9E4F2"/>
+            </w:tcBorders>
+            <w:shd w:val="clear" w:color="auto" w:fill="FFFFFF"/>
+            <w:tcMar>
+              <w:top w:w="135" w:type="dxa"/>
+              <w:left w:w="180" w:type="dxa"/>
+              <w:bottom w:w="135" w:type="dxa"/>
+              <w:right w:w="180" w:type="dxa"/>
+            </w:tcMar>
+            <w:vAlign w:val="center"/>
+          </w:tcPr>
+          <w:p>
+            <w:pPr>
+              <w:spacing w:after="0" w:line="240" w:lineRule="auto"/>
+              <w:rPr>
+                <w:rFonts w:asciiTheme="majorHAnsi" w:eastAsia="Times New Roman" w:hAnsiTheme="majorHAnsi" w:cstheme="majorHAnsi"/>
+                <w:bCs/>
+                <w:color w:val="003383"/>
+                <w:lang w:eastAsia="pt-BR"/>
+              </w:rPr>
+            </w:pPr>
+            <w:r>
+              <w:rPr>
+                <w:rFonts w:asciiTheme="majorHAnsi" w:eastAsia="Times New Roman" w:hAnsiTheme="majorHAnsi" w:cstheme="majorHAnsi"/>
+                <w:color w:val="auto"/>
+                <w:lang w:eastAsia="pt-BR"/>
+              </w:rPr>
+              <w:t>E4</w:t>
+            </w:r>
+          </w:p>
+        </w:tc>
+        <w:tc>
+          <w:tcPr>
+            <w:tcW w:w="3162" w:type="dxa"/>
+            <w:tcBorders>
+              <w:bottom w:val="single" w:sz="12" w:space="0" w:color="D9E4F2"/>
+            </w:tcBorders>
+            <w:shd w:val="clear" w:color="auto" w:fill="FFFFFF"/>
+            <w:tcMar>
+              <w:top w:w="135" w:type="dxa"/>
+              <w:left w:w="180" w:type="dxa"/>
+              <w:bottom w:w="135" w:type="dxa"/>
+              <w:right w:w="180" w:type="dxa"/>
+            </w:tcMar>
+            <w:vAlign w:val="center"/>
+          </w:tcPr>
+          <w:p>
+            <w:pPr>
+              <w:spacing w:after="0" w:line="240" w:lineRule="auto"/>
+              <w:rPr>
+                <w:rFonts w:asciiTheme="majorHAnsi" w:eastAsia="Times New Roman" w:hAnsiTheme="majorHAnsi" w:cstheme="majorHAnsi"/>
+                <w:bCs/>
+                <w:color w:val="003383"/>
+                <w:lang w:eastAsia="pt-BR"/>
+              </w:rPr>
+            </w:pPr>
+            <w:r>
+              <w:rPr>
+                <w:rFonts w:asciiTheme="majorHAnsi" w:eastAsia="Calibri" w:hAnsiTheme="majorHAnsi" w:cstheme="majorHAnsi"/>
+                <w:color w:val="auto"/>
+              </w:rPr>
+              <w:t>Manter um painel de histórico para o emissor</w:t>
+            </w:r>
+          </w:p>
+        </w:tc>
+        <w:tc>
+          <w:tcPr>
+            <w:tcW w:w="4774" w:type="dxa"/>
+            <w:tcBorders>
+              <w:bottom w:val="single" w:sz="12" w:space="0" w:color="D9E4F2"/>
+            </w:tcBorders>
+            <w:shd w:val="clear" w:color="auto" w:fill="FFFFFF"/>
+            <w:tcMar>
+              <w:top w:w="135" w:type="dxa"/>
+              <w:left w:w="180" w:type="dxa"/>
+              <w:bottom w:w="135" w:type="dxa"/>
+              <w:right w:w="180" w:type="dxa"/>
+            </w:tcMar>
+            <w:vAlign w:val="center"/>
+          </w:tcPr>
+          <w:p>
+            <w:pPr>
+              <w:spacing w:after="0" w:line="240" w:lineRule="auto"/>
+              <w:rPr>
+                <w:rFonts w:asciiTheme="majorHAnsi" w:eastAsia="Times New Roman" w:hAnsiTheme="majorHAnsi" w:cstheme="majorHAnsi"/>
+                <w:bCs/>
+                <w:color w:val="003383"/>
+                <w:lang w:eastAsia="pt-BR"/>
+              </w:rPr>
+            </w:pPr>
+            <w:r>
+              <w:rPr>
+                <w:bCs/>
+              </w:rPr>
+              <w:t>O emissor formalizado</w:t>
+            </w:r>
+            <w:r>
+              <w:t xml:space="preserve"> faz </w:t>
+            </w:r>
+            <w:r>
+              <w:rPr>
+                <w:bCs/>
+              </w:rPr>
+              <w:t>o acesso ao painel de gerenciamento</w:t>
+            </w:r>
+            <w:r>
+              <w:t xml:space="preserve"> e </w:t>
+            </w:r>
+            <w:r>
+              <w:rPr>
+                <w:bCs/>
+              </w:rPr>
+              <w:t>o sistema exibe a lista de certificados gerados e sua rastreabilidade.</w:t>
+            </w:r>
+            <w:bookmarkStart w:id="0" w:name="_GoBack"/>
+            <w:bookmarkEnd w:id="0"/>
+          </w:p>
+        </w:tc>
+        <w:tc>
+          <w:tcPr>
+            <w:tcW w:w="0" w:type="auto"/>
+            <w:tcBorders>
+              <w:bottom w:val="single" w:sz="12" w:space="0" w:color="D9E4F2"/>
+            </w:tcBorders>
+            <w:shd w:val="clear" w:color="auto" w:fill="FFFFFF"/>
+            <w:tcMar>
+              <w:top w:w="135" w:type="dxa"/>
+              <w:left w:w="180" w:type="dxa"/>
+              <w:bottom w:w="135" w:type="dxa"/>
+              <w:right w:w="180" w:type="dxa"/>
+            </w:tcMar>
+            <w:vAlign w:val="center"/>
+          </w:tcPr>
+          <w:p>
+            <w:pPr>
+              <w:spacing w:after="0" w:line="240" w:lineRule="auto"/>
+              <w:rPr>
+                <w:rFonts w:asciiTheme="majorHAnsi" w:eastAsia="Times New Roman" w:hAnsiTheme="majorHAnsi" w:cstheme="majorHAnsi"/>
+                <w:bCs/>
+                <w:color w:val="003383"/>
+                <w:lang w:eastAsia="pt-BR"/>
+              </w:rPr>
+            </w:pPr>
+            <w:r>
+              <w:rPr>
+                <w:rFonts w:asciiTheme="majorHAnsi" w:eastAsia="Times New Roman" w:hAnsiTheme="majorHAnsi" w:cstheme="majorHAnsi"/>
+                <w:color w:val="auto"/>
+                <w:lang w:eastAsia="pt-BR"/>
+              </w:rPr>
+              <w:t>OE4</w:t>
+            </w:r>
+          </w:p>
+        </w:tc>
+        <w:tc>
+          <w:tcPr>
+            <w:tcW w:w="0" w:type="auto"/>
+            <w:tcBorders>
+              <w:bottom w:val="single" w:sz="12" w:space="0" w:color="D9E4F2"/>
+            </w:tcBorders>
+            <w:shd w:val="clear" w:color="auto" w:fill="FFFFFF"/>
+            <w:tcMar>
+              <w:top w:w="135" w:type="dxa"/>
+              <w:left w:w="180" w:type="dxa"/>
+              <w:bottom w:w="135" w:type="dxa"/>
+              <w:right w:w="180" w:type="dxa"/>
+            </w:tcMar>
+            <w:vAlign w:val="center"/>
+          </w:tcPr>
+          <w:p>
+            <w:pPr>
+              <w:spacing w:after="0" w:line="240" w:lineRule="auto"/>
+              <w:rPr>
+                <w:rFonts w:asciiTheme="majorHAnsi" w:eastAsia="Times New Roman" w:hAnsiTheme="majorHAnsi" w:cstheme="majorHAnsi"/>
+                <w:bCs/>
+                <w:color w:val="003383"/>
+                <w:lang w:eastAsia="pt-BR"/>
+              </w:rPr>
+            </w:pPr>
+            <w:r>
+              <w:rPr>
+                <w:rFonts w:asciiTheme="majorHAnsi" w:eastAsia="Times New Roman" w:hAnsiTheme="majorHAnsi" w:cstheme="majorHAnsi"/>
+                <w:color w:val="auto"/>
+                <w:lang w:eastAsia="pt-BR"/>
+              </w:rPr>
+              <w:t>G</w:t>
             </w:r>
           </w:p>
         </w:tc>
@@ -843,7 +1655,7 @@
                 <w:color w:val="auto"/>
                 <w:lang w:eastAsia="pt-BR"/>
               </w:rPr>
-              <w:t>E1</w:t>
+              <w:t>E5</w:t>
             </w:r>
           </w:p>
         </w:tc>
@@ -873,11 +1685,7 @@
               </w:rPr>
             </w:pPr>
             <w:r>
-              <w:rPr>
-                <w:rFonts w:asciiTheme="majorHAnsi" w:eastAsia="Calibri" w:hAnsiTheme="majorHAnsi" w:cstheme="majorHAnsi"/>
-                <w:color w:val="auto"/>
-              </w:rPr>
-              <w:t>Autenticar e restringir o acesso de registro de certificados</w:t>
+              <w:t>Cadastrar e validar novos emissores no sistema</w:t>
             </w:r>
           </w:p>
         </w:tc>
@@ -908,12 +1716,27 @@
             </w:pPr>
             <w:r>
               <w:rPr>
-                <w:rFonts w:asciiTheme="majorHAnsi" w:eastAsia="Times New Roman" w:hAnsiTheme="majorHAnsi" w:cstheme="majorHAnsi"/>
                 <w:bCs/>
-                <w:color w:val="auto"/>
-                <w:lang w:eastAsia="pt-BR"/>
               </w:rPr>
-              <w:t>Há a tentativa de consulta de aluno ou alguma outra pessoa, fora a empresa emissora</w:t>
+              <w:t>O administrador do sistema</w:t>
+            </w:r>
+            <w:r>
+              <w:t xml:space="preserve"> faz </w:t>
+            </w:r>
+            <w:r>
+              <w:rPr>
+                <w:bCs/>
+              </w:rPr>
+              <w:t>a análise da documentação de uma instituição/MEI</w:t>
+            </w:r>
+            <w:r>
+              <w:t xml:space="preserve"> e </w:t>
+            </w:r>
+            <w:r>
+              <w:rPr>
+                <w:bCs/>
+              </w:rPr>
+              <w:t>o perfil do emissor é ativado para uso na plataforma.</w:t>
             </w:r>
           </w:p>
         </w:tc>
@@ -949,7 +1772,7 @@
                 <w:color w:val="auto"/>
                 <w:lang w:eastAsia="pt-BR"/>
               </w:rPr>
-              <w:t>OE1</w:t>
+              <w:t>EO1</w:t>
             </w:r>
           </w:p>
         </w:tc>
@@ -1023,11 +1846,10 @@
             <w:r>
               <w:rPr>
                 <w:rFonts w:asciiTheme="majorHAnsi" w:eastAsia="Times New Roman" w:hAnsiTheme="majorHAnsi" w:cstheme="majorHAnsi"/>
-                <w:bCs/>
                 <w:color w:val="auto"/>
                 <w:lang w:eastAsia="pt-BR"/>
               </w:rPr>
-              <w:t>E2</w:t>
+              <w:t>E6</w:t>
             </w:r>
           </w:p>
         </w:tc>
@@ -1057,11 +1879,7 @@
               </w:rPr>
             </w:pPr>
             <w:r>
-              <w:rPr>
-                <w:rFonts w:asciiTheme="majorHAnsi" w:eastAsia="Calibri" w:hAnsiTheme="majorHAnsi" w:cstheme="majorHAnsi"/>
-                <w:color w:val="auto"/>
-              </w:rPr>
-              <w:t>Registrar os certificados</w:t>
+              <w:t>Permitir a revogação de certificados emitidos</w:t>
             </w:r>
           </w:p>
         </w:tc>
@@ -1092,12 +1910,27 @@
             </w:pPr>
             <w:r>
               <w:rPr>
-                <w:rFonts w:asciiTheme="majorHAnsi" w:eastAsia="Times New Roman" w:hAnsiTheme="majorHAnsi" w:cstheme="majorHAnsi"/>
                 <w:bCs/>
-                <w:color w:val="auto"/>
-                <w:lang w:eastAsia="pt-BR"/>
               </w:rPr>
-              <w:t>A empresa já está cadastrada e um aluno encerra o curso</w:t>
+              <w:t xml:space="preserve">O emissor formalizado </w:t>
+            </w:r>
+            <w:r>
+              <w:t xml:space="preserve">faz </w:t>
+            </w:r>
+            <w:r>
+              <w:rPr>
+                <w:bCs/>
+              </w:rPr>
+              <w:t>a solicitação de revogação de um certificado no painel</w:t>
+            </w:r>
+            <w:r>
+              <w:t xml:space="preserve"> e </w:t>
+            </w:r>
+            <w:r>
+              <w:rPr>
+                <w:bCs/>
+              </w:rPr>
+              <w:t>o status do documento é atualizado para "inválido" nas consultas.</w:t>
             </w:r>
           </w:p>
         </w:tc>
@@ -1129,11 +1962,10 @@
             <w:r>
               <w:rPr>
                 <w:rFonts w:asciiTheme="majorHAnsi" w:eastAsia="Times New Roman" w:hAnsiTheme="majorHAnsi" w:cstheme="majorHAnsi"/>
-                <w:bCs/>
                 <w:color w:val="auto"/>
                 <w:lang w:eastAsia="pt-BR"/>
               </w:rPr>
-              <w:t>OE2</w:t>
+              <w:t>E04</w:t>
             </w:r>
           </w:p>
         </w:tc>
@@ -1165,11 +1997,10 @@
             <w:r>
               <w:rPr>
                 <w:rFonts w:asciiTheme="majorHAnsi" w:eastAsia="Times New Roman" w:hAnsiTheme="majorHAnsi" w:cstheme="majorHAnsi"/>
-                <w:bCs/>
                 <w:color w:val="auto"/>
                 <w:lang w:eastAsia="pt-BR"/>
               </w:rPr>
-              <w:t>G</w:t>
+              <w:t>P</w:t>
             </w:r>
           </w:p>
         </w:tc>
@@ -1211,7 +2042,7 @@
                 <w:color w:val="auto"/>
                 <w:lang w:eastAsia="pt-BR"/>
               </w:rPr>
-              <w:t>E3</w:t>
+              <w:t>E7</w:t>
             </w:r>
           </w:p>
         </w:tc>
@@ -1241,11 +2072,7 @@
               </w:rPr>
             </w:pPr>
             <w:r>
-              <w:rPr>
-                <w:rFonts w:asciiTheme="majorHAnsi" w:eastAsia="Calibri" w:hAnsiTheme="majorHAnsi" w:cstheme="majorHAnsi"/>
-                <w:color w:val="auto"/>
-              </w:rPr>
-              <w:t>Disponibilizar uma interface de consulta pública</w:t>
+              <w:t>Disponibilizar emissão de comprovante digital (PDF)</w:t>
             </w:r>
           </w:p>
         </w:tc>
@@ -1276,21 +2103,27 @@
             </w:pPr>
             <w:r>
               <w:rPr>
-                <w:rFonts w:asciiTheme="majorHAnsi" w:eastAsia="Times New Roman" w:hAnsiTheme="majorHAnsi" w:cstheme="majorHAnsi"/>
                 <w:bCs/>
-                <w:color w:val="auto"/>
-                <w:lang w:eastAsia="pt-BR"/>
               </w:rPr>
-              <w:t xml:space="preserve">Alguma pessoa decide consultar a credibilidade de um certificado com </w:t>
+              <w:t>O usuário da consulta pública</w:t>
+            </w:r>
+            <w:r>
+              <w:t xml:space="preserve"> faz </w:t>
             </w:r>
             <w:r>
               <w:rPr>
-                <w:rFonts w:asciiTheme="majorHAnsi" w:eastAsia="Times New Roman" w:hAnsiTheme="majorHAnsi" w:cstheme="majorHAnsi"/>
                 <w:bCs/>
-                <w:color w:val="auto"/>
-                <w:lang w:eastAsia="pt-BR"/>
               </w:rPr>
-              <w:t>a chave de autenticação</w:t>
+              <w:t>a validação bem-sucedida de uma chave autêntica</w:t>
+            </w:r>
+            <w:r>
+              <w:t xml:space="preserve"> e </w:t>
+            </w:r>
+            <w:r>
+              <w:rPr>
+                <w:bCs/>
+              </w:rPr>
+              <w:t>o sistema disponibiliza um comprovante de veracidade para download].</w:t>
             </w:r>
           </w:p>
         </w:tc>
@@ -1326,7 +2159,7 @@
                 <w:color w:val="auto"/>
                 <w:lang w:eastAsia="pt-BR"/>
               </w:rPr>
-              <w:t>OE3</w:t>
+              <w:t>EO3</w:t>
             </w:r>
           </w:p>
         </w:tc>
@@ -1362,7 +2195,7 @@
                 <w:color w:val="auto"/>
                 <w:lang w:eastAsia="pt-BR"/>
               </w:rPr>
-              <w:t>P</w:t>
+              <w:t>p</w:t>
             </w:r>
           </w:p>
         </w:tc>
@@ -1402,15 +2235,7 @@
                 <w:color w:val="auto"/>
                 <w:lang w:eastAsia="pt-BR"/>
               </w:rPr>
-              <w:t>E</w:t>
-            </w:r>
-            <w:r>
-              <w:rPr>
-                <w:rFonts w:asciiTheme="majorHAnsi" w:eastAsia="Times New Roman" w:hAnsiTheme="majorHAnsi" w:cstheme="majorHAnsi"/>
-                <w:color w:val="auto"/>
-                <w:lang w:eastAsia="pt-BR"/>
-              </w:rPr>
-              <w:t>4</w:t>
+              <w:t>E8</w:t>
             </w:r>
           </w:p>
         </w:tc>
@@ -1440,11 +2265,7 @@
               </w:rPr>
             </w:pPr>
             <w:r>
-              <w:rPr>
-                <w:rFonts w:asciiTheme="majorHAnsi" w:eastAsia="Calibri" w:hAnsiTheme="majorHAnsi" w:cstheme="majorHAnsi"/>
-                <w:color w:val="auto"/>
-              </w:rPr>
-              <w:t>Manter um painel de histórico para o emissor</w:t>
+              <w:t>Exibir métricas e estatísticas de uso no painel</w:t>
             </w:r>
           </w:p>
         </w:tc>
@@ -1475,11 +2296,27 @@
             </w:pPr>
             <w:r>
               <w:rPr>
-                <w:rFonts w:asciiTheme="majorHAnsi" w:eastAsia="Times New Roman" w:hAnsiTheme="majorHAnsi" w:cstheme="majorHAnsi"/>
-                <w:color w:val="auto"/>
-                <w:lang w:eastAsia="pt-BR"/>
+                <w:bCs/>
               </w:rPr>
-              <w:t>A partir do momento que a empresa é cadastrada e insere o primeiro certificado</w:t>
+              <w:t>O emissor formalizado</w:t>
+            </w:r>
+            <w:r>
+              <w:t xml:space="preserve"> faz </w:t>
+            </w:r>
+            <w:r>
+              <w:rPr>
+                <w:bCs/>
+              </w:rPr>
+              <w:t>a navegação para a página inicial do painel</w:t>
+            </w:r>
+            <w:r>
+              <w:t xml:space="preserve"> e </w:t>
+            </w:r>
+            <w:r>
+              <w:rPr>
+                <w:bCs/>
+              </w:rPr>
+              <w:t>o sistema exibe gráficos com o total de certificados emitidos e consultados.</w:t>
             </w:r>
           </w:p>
         </w:tc>
@@ -1514,7 +2351,7 @@
                 <w:color w:val="auto"/>
                 <w:lang w:eastAsia="pt-BR"/>
               </w:rPr>
-              <w:t>OE4</w:t>
+              <w:t>E04</w:t>
             </w:r>
           </w:p>
         </w:tc>
@@ -1549,7 +2386,7 @@
                 <w:color w:val="auto"/>
                 <w:lang w:eastAsia="pt-BR"/>
               </w:rPr>
-              <w:t>G</w:t>
+              <w:t>M</w:t>
             </w:r>
           </w:p>
         </w:tc>
@@ -1587,6 +2424,7 @@
           <w:sz w:val="32"/>
           <w:szCs w:val="32"/>
         </w:rPr>
+        <w:lastRenderedPageBreak/>
         <w:t xml:space="preserve">4. </w:t>
       </w:r>
       <w:r>
@@ -1850,8 +2688,6 @@
             <w:r>
               <w:t>hash</w:t>
             </w:r>
-            <w:bookmarkStart w:id="0" w:name="_GoBack"/>
-            <w:bookmarkEnd w:id="0"/>
             <w:proofErr w:type="spellEnd"/>
             <w:r>
               <w:t>, além de facilitar o agrupamento de certificados por empresa.</w:t>
@@ -1882,7 +2718,6 @@
           <w:sz w:val="32"/>
           <w:szCs w:val="32"/>
         </w:rPr>
-        <w:lastRenderedPageBreak/>
         <w:t>5. Viabilidade</w:t>
       </w:r>
     </w:p>
@@ -13843,7 +14678,7 @@
 </file>
 
 <file path=customXml/itemProps1.xml><?xml version="1.0" encoding="utf-8"?>
-<ds:datastoreItem xmlns:ds="http://schemas.openxmlformats.org/officeDocument/2006/customXml" ds:itemID="{328EB984-D75D-4FA3-A900-51A767A3F793}">
+<ds:datastoreItem xmlns:ds="http://schemas.openxmlformats.org/officeDocument/2006/customXml" ds:itemID="{53BF3306-8534-4775-967F-16CBC53BE0B7}">
   <ds:schemaRefs>
     <ds:schemaRef ds:uri="http://schemas.openxmlformats.org/officeDocument/2006/bibliography"/>
   </ds:schemaRefs>

</xml_diff>